<commit_message>
Update Arb study notes to 2026-07-06 release
</commit_message>
<xml_diff>
--- a/ind/docx/11.content.docx
+++ b/ind/docx/11.content.docx
@@ -5004,6 +5004,4359 @@
           <w:lang w:val="id_ID" w:bidi="id_ID"/>
         </w:rPr>
         <w:t>), menggantikannya sebagai imam besar.</w:t>
+      </w:r>
+      <w:r>
+        <w:rPr>
+          <w:lang w:val="id_ID" w:bidi="id_ID"/>
+        </w:rPr>
+      </w:r>
+      <w:r>
+        <w:rPr>
+          <w:lang w:val="id_ID" w:bidi="id_ID"/>
+        </w:rPr>
+      </w:r>
+    </w:p>
+    <w:p>
+      <w:pPr/>
+      <w:r>
+        <w:rPr>
+          <w:lang w:val="id_ID" w:bidi="id_ID"/>
+        </w:rPr>
+      </w:r>
+    </w:p>
+    <w:p>
+      <w:pPr>
+        <w:pStyle w:val="Heading2"/>
+      </w:pPr>
+      <w:r>
+        <w:rPr>
+          <w:lang w:val="id_ID" w:bidi="id_ID"/>
+        </w:rPr>
+        <w:t>1 Raja-raja 4:3</w:t>
+      </w:r>
+      <w:r>
+        <w:rPr>
+          <w:lang w:val="id_ID" w:bidi="id_ID"/>
+        </w:rPr>
+      </w:r>
+    </w:p>
+    <w:p>
+      <w:pPr/>
+      <w:r>
+        <w:rPr>
+          <w:lang w:val="id_ID" w:bidi="id_ID"/>
+        </w:rPr>
+      </w:r>
+      <w:r>
+        <w:rPr>
+          <w:lang w:val="id_ID" w:bidi="id_ID"/>
+        </w:rPr>
+        <w:t>Panitera negara adalah pejabat negara dan sekretaris pribadi Salomo. Sisa, ayah dari Elihoref dan Ahia, telah melayani Daud dalam kapasitas ini (</w:t>
+      </w:r>
+      <w:hyperlink r:id="rId105">
+        <w:r>
+          <w:rPr>
+            <w:lang w:val="id_ID" w:bidi="id_ID"/>
+          </w:rPr>
+          <w:rPr>
+            <w:color w:val="0000EE"/>
+            <w:u w:val="single"/>
+          </w:rPr>
+          <w:t>2Sam. 8:17</w:t>
+        </w:r>
+      </w:hyperlink>
+      <w:r>
+        <w:rPr>
+          <w:lang w:val="id_ID" w:bidi="id_ID"/>
+        </w:rPr>
+        <w:t xml:space="preserve">; </w:t>
+      </w:r>
+      <w:hyperlink r:id="rId147">
+        <w:r>
+          <w:rPr>
+            <w:lang w:val="id_ID" w:bidi="id_ID"/>
+          </w:rPr>
+          <w:rPr>
+            <w:color w:val="0000EE"/>
+            <w:u w:val="single"/>
+          </w:rPr>
+          <w:t>20:25</w:t>
+        </w:r>
+      </w:hyperlink>
+      <w:r>
+        <w:rPr>
+          <w:lang w:val="id_ID" w:bidi="id_ID"/>
+        </w:rPr>
+        <w:t xml:space="preserve">; </w:t>
+      </w:r>
+      <w:hyperlink r:id="rId148">
+        <w:r>
+          <w:rPr>
+            <w:lang w:val="id_ID" w:bidi="id_ID"/>
+          </w:rPr>
+          <w:rPr>
+            <w:color w:val="0000EE"/>
+            <w:u w:val="single"/>
+          </w:rPr>
+          <w:t>1Taw. 18:16</w:t>
+        </w:r>
+      </w:hyperlink>
+      <w:r>
+        <w:rPr>
+          <w:lang w:val="id_ID" w:bidi="id_ID"/>
+        </w:rPr>
+        <w:t xml:space="preserve">). • Sejarawan kerajaan berfungsi sebagai kepala protokol untuk urusan dan upacara istana. Seperti di Mesir dan Mesopotamia kuno, pejabat semacam itu sering mewakili raja dalam negosiasi penting (lihat </w:t>
+      </w:r>
+      <w:hyperlink r:id="rId149">
+        <w:r>
+          <w:rPr>
+            <w:lang w:val="id_ID" w:bidi="id_ID"/>
+          </w:rPr>
+          <w:rPr>
+            <w:color w:val="0000EE"/>
+            <w:u w:val="single"/>
+          </w:rPr>
+          <w:t>2Raj. 18:18</w:t>
+        </w:r>
+      </w:hyperlink>
+      <w:r>
+        <w:rPr>
+          <w:lang w:val="id_ID" w:bidi="id_ID"/>
+        </w:rPr>
+        <w:t xml:space="preserve">; </w:t>
+      </w:r>
+      <w:hyperlink r:id="rId150">
+        <w:r>
+          <w:rPr>
+            <w:lang w:val="id_ID" w:bidi="id_ID"/>
+          </w:rPr>
+          <w:rPr>
+            <w:color w:val="0000EE"/>
+            <w:u w:val="single"/>
+          </w:rPr>
+          <w:t>2Taw. 34:8</w:t>
+        </w:r>
+      </w:hyperlink>
+      <w:r>
+        <w:rPr>
+          <w:lang w:val="id_ID" w:bidi="id_ID"/>
+        </w:rPr>
+        <w:t>).</w:t>
+      </w:r>
+      <w:r>
+        <w:rPr>
+          <w:lang w:val="id_ID" w:bidi="id_ID"/>
+        </w:rPr>
+      </w:r>
+      <w:r>
+        <w:rPr>
+          <w:lang w:val="id_ID" w:bidi="id_ID"/>
+        </w:rPr>
+      </w:r>
+    </w:p>
+    <w:p>
+      <w:pPr/>
+      <w:r>
+        <w:rPr>
+          <w:lang w:val="id_ID" w:bidi="id_ID"/>
+        </w:rPr>
+      </w:r>
+    </w:p>
+    <w:p>
+      <w:pPr>
+        <w:pStyle w:val="Heading2"/>
+      </w:pPr>
+      <w:r>
+        <w:rPr>
+          <w:lang w:val="id_ID" w:bidi="id_ID"/>
+        </w:rPr>
+        <w:t>1 Raja-raja 4:4</w:t>
+      </w:r>
+      <w:r>
+        <w:rPr>
+          <w:lang w:val="id_ID" w:bidi="id_ID"/>
+        </w:rPr>
+      </w:r>
+    </w:p>
+    <w:p>
+      <w:pPr/>
+      <w:r>
+        <w:rPr>
+          <w:lang w:val="id_ID" w:bidi="id_ID"/>
+        </w:rPr>
+      </w:r>
+      <w:r>
+        <w:rPr>
+          <w:lang w:val="id_ID" w:bidi="id_ID"/>
+        </w:rPr>
+        <w:t>Benaya . . . Zadok dan Abyatar: Ketiga orang ini juga memegang jabatan khusus dalam pemerintahan Daud. Meskipun dicopot dari jabatan imam besar (</w:t>
+      </w:r>
+      <w:hyperlink r:id="rId151">
+        <w:r>
+          <w:rPr>
+            <w:lang w:val="id_ID" w:bidi="id_ID"/>
+          </w:rPr>
+          <w:rPr>
+            <w:color w:val="0000EE"/>
+            <w:u w:val="single"/>
+          </w:rPr>
+          <w:t>1Raj. 2:26–27</w:t>
+        </w:r>
+      </w:hyperlink>
+      <w:r>
+        <w:rPr>
+          <w:lang w:val="id_ID" w:bidi="id_ID"/>
+        </w:rPr>
+        <w:t xml:space="preserve">), </w:t>
+      </w:r>
+      <w:r>
+        <w:rPr>
+          <w:i/>
+          <w:lang w:val="id_ID" w:bidi="id_ID"/>
+        </w:rPr>
+        <w:t>Abyatar</w:t>
+      </w:r>
+      <w:r>
+        <w:rPr>
+          <w:lang w:val="id_ID" w:bidi="id_ID"/>
+        </w:rPr>
+        <w:t xml:space="preserve"> masih berfungsi sebagai imam.</w:t>
+      </w:r>
+      <w:r>
+        <w:rPr>
+          <w:lang w:val="id_ID" w:bidi="id_ID"/>
+        </w:rPr>
+      </w:r>
+      <w:r>
+        <w:rPr>
+          <w:lang w:val="id_ID" w:bidi="id_ID"/>
+        </w:rPr>
+      </w:r>
+    </w:p>
+    <w:p>
+      <w:pPr/>
+      <w:r>
+        <w:rPr>
+          <w:lang w:val="id_ID" w:bidi="id_ID"/>
+        </w:rPr>
+      </w:r>
+    </w:p>
+    <w:p>
+      <w:pPr>
+        <w:pStyle w:val="Heading2"/>
+      </w:pPr>
+      <w:r>
+        <w:rPr>
+          <w:lang w:val="id_ID" w:bidi="id_ID"/>
+        </w:rPr>
+        <w:t>1 Raja-raja 4:5</w:t>
+      </w:r>
+      <w:r>
+        <w:rPr>
+          <w:lang w:val="id_ID" w:bidi="id_ID"/>
+        </w:rPr>
+      </w:r>
+    </w:p>
+    <w:p>
+      <w:pPr/>
+      <w:r>
+        <w:rPr>
+          <w:lang w:val="id_ID" w:bidi="id_ID"/>
+        </w:rPr>
+      </w:r>
+      <w:r>
+        <w:rPr>
+          <w:lang w:val="id_ID" w:bidi="id_ID"/>
+        </w:rPr>
+        <w:t>Dua putra Natan juga melayani di lingkaran dalam Salomo. Azarya mengawasi dua belas gubernur distrik, sementara Zabut adalah penasihat terpercaya, posisi yang sebelumnya dipegang oleh Husai di bawah Daud (</w:t>
+      </w:r>
+      <w:hyperlink r:id="rId152">
+        <w:r>
+          <w:rPr>
+            <w:lang w:val="id_ID" w:bidi="id_ID"/>
+          </w:rPr>
+          <w:rPr>
+            <w:color w:val="0000EE"/>
+            <w:u w:val="single"/>
+          </w:rPr>
+          <w:t>2Sam. 15:37</w:t>
+        </w:r>
+      </w:hyperlink>
+      <w:r>
+        <w:rPr>
+          <w:lang w:val="id_ID" w:bidi="id_ID"/>
+        </w:rPr>
+        <w:t>).</w:t>
+      </w:r>
+      <w:r>
+        <w:rPr>
+          <w:lang w:val="id_ID" w:bidi="id_ID"/>
+        </w:rPr>
+      </w:r>
+      <w:r>
+        <w:rPr>
+          <w:lang w:val="id_ID" w:bidi="id_ID"/>
+        </w:rPr>
+      </w:r>
+    </w:p>
+    <w:p>
+      <w:pPr/>
+      <w:r>
+        <w:rPr>
+          <w:lang w:val="id_ID" w:bidi="id_ID"/>
+        </w:rPr>
+      </w:r>
+    </w:p>
+    <w:p>
+      <w:pPr>
+        <w:pStyle w:val="Heading2"/>
+      </w:pPr>
+      <w:r>
+        <w:rPr>
+          <w:lang w:val="id_ID" w:bidi="id_ID"/>
+        </w:rPr>
+        <w:t>1 Raja-raja 4:6</w:t>
+      </w:r>
+      <w:r>
+        <w:rPr>
+          <w:lang w:val="id_ID" w:bidi="id_ID"/>
+        </w:rPr>
+      </w:r>
+    </w:p>
+    <w:p>
+      <w:pPr/>
+      <w:r>
+        <w:rPr>
+          <w:lang w:val="id_ID" w:bidi="id_ID"/>
+        </w:rPr>
+      </w:r>
+      <w:r>
+        <w:rPr>
+          <w:lang w:val="id_ID" w:bidi="id_ID"/>
+        </w:rPr>
+        <w:t>Ahisar berfungsi sebagai pengelola properti istana, sebuah jabatan yang menjadi kuat di bawah putra Uzia, Yotam (</w:t>
+      </w:r>
+      <w:hyperlink r:id="rId153">
+        <w:r>
+          <w:rPr>
+            <w:lang w:val="id_ID" w:bidi="id_ID"/>
+          </w:rPr>
+          <w:rPr>
+            <w:color w:val="0000EE"/>
+            <w:u w:val="single"/>
+          </w:rPr>
+          <w:t>2Raj. 15:5</w:t>
+        </w:r>
+      </w:hyperlink>
+      <w:r>
+        <w:rPr>
+          <w:lang w:val="id_ID" w:bidi="id_ID"/>
+        </w:rPr>
+        <w:t>). Kemudian, posisi ini dipegang oleh Elyakim, salah satu perwakilan Hizkia, yang bertemu dengan utusan dari Raja Sanherib dari Asyur selama negosiasi mengenai pengepungan Yerusalem (</w:t>
+      </w:r>
+      <w:hyperlink r:id="rId149">
+        <w:r>
+          <w:rPr>
+            <w:lang w:val="id_ID" w:bidi="id_ID"/>
+          </w:rPr>
+          <w:rPr>
+            <w:color w:val="0000EE"/>
+            <w:u w:val="single"/>
+          </w:rPr>
+          <w:t>2Raj. 18:18</w:t>
+        </w:r>
+      </w:hyperlink>
+      <w:r>
+        <w:rPr>
+          <w:lang w:val="id_ID" w:bidi="id_ID"/>
+        </w:rPr>
+        <w:t>). • Adoniram adalah kepala sistem kerja paksa. Samuel telah memperingatkan tentang lembaga yang tidak menyenangkan ini (</w:t>
+      </w:r>
+      <w:hyperlink r:id="rId154">
+        <w:r>
+          <w:rPr>
+            <w:lang w:val="id_ID" w:bidi="id_ID"/>
+          </w:rPr>
+          <w:rPr>
+            <w:color w:val="0000EE"/>
+            <w:u w:val="single"/>
+          </w:rPr>
+          <w:t>1Sam. 8:12–17</w:t>
+        </w:r>
+      </w:hyperlink>
+      <w:r>
+        <w:rPr>
+          <w:lang w:val="id_ID" w:bidi="id_ID"/>
+        </w:rPr>
+        <w:t>), dan para pemimpin Israel kemudian mengeluhkannya kepada putra Salomo, Rehabeam (</w:t>
+      </w:r>
+      <w:hyperlink r:id="rId155">
+        <w:r>
+          <w:rPr>
+            <w:lang w:val="id_ID" w:bidi="id_ID"/>
+          </w:rPr>
+          <w:rPr>
+            <w:color w:val="0000EE"/>
+            <w:u w:val="single"/>
+          </w:rPr>
+          <w:t>1Raj. 12:4</w:t>
+        </w:r>
+      </w:hyperlink>
+      <w:r>
+        <w:rPr>
+          <w:lang w:val="id_ID" w:bidi="id_ID"/>
+        </w:rPr>
+        <w:t>).</w:t>
+      </w:r>
+      <w:r>
+        <w:rPr>
+          <w:lang w:val="id_ID" w:bidi="id_ID"/>
+        </w:rPr>
+      </w:r>
+      <w:r>
+        <w:rPr>
+          <w:lang w:val="id_ID" w:bidi="id_ID"/>
+        </w:rPr>
+      </w:r>
+    </w:p>
+    <w:p>
+      <w:pPr/>
+      <w:r>
+        <w:rPr>
+          <w:lang w:val="id_ID" w:bidi="id_ID"/>
+        </w:rPr>
+      </w:r>
+    </w:p>
+    <w:p>
+      <w:pPr>
+        <w:pStyle w:val="Heading2"/>
+      </w:pPr>
+      <w:r>
+        <w:rPr>
+          <w:lang w:val="id_ID" w:bidi="id_ID"/>
+        </w:rPr>
+        <w:t>1 Raja-raja 4:7–19</w:t>
+      </w:r>
+      <w:r>
+        <w:rPr>
+          <w:lang w:val="id_ID" w:bidi="id_ID"/>
+        </w:rPr>
+      </w:r>
+    </w:p>
+    <w:p>
+      <w:pPr/>
+      <w:r>
+        <w:rPr>
+          <w:lang w:val="id_ID" w:bidi="id_ID"/>
+        </w:rPr>
+      </w:r>
+      <w:r>
+        <w:rPr>
+          <w:lang w:val="id_ID" w:bidi="id_ID"/>
+        </w:rPr>
+        <w:t>Kedua belas kepala daerah kemungkinan besar menangani tugas-tugas administratif yang lebih ringan, seperti mengamankan pendapatan dan menyediakan makanan untuk rumah tangga raja. Kedua belas distrik Salomo tidak persis sama dengan pembagian suku yang lama.</w:t>
+      </w:r>
+      <w:r>
+        <w:rPr>
+          <w:lang w:val="id_ID" w:bidi="id_ID"/>
+        </w:rPr>
+      </w:r>
+      <w:r>
+        <w:rPr>
+          <w:lang w:val="id_ID" w:bidi="id_ID"/>
+        </w:rPr>
+      </w:r>
+    </w:p>
+    <w:p>
+      <w:pPr/>
+      <w:r>
+        <w:rPr>
+          <w:lang w:val="id_ID" w:bidi="id_ID"/>
+        </w:rPr>
+      </w:r>
+    </w:p>
+    <w:p>
+      <w:pPr>
+        <w:pStyle w:val="Heading2"/>
+      </w:pPr>
+      <w:r>
+        <w:rPr>
+          <w:lang w:val="id_ID" w:bidi="id_ID"/>
+        </w:rPr>
+        <w:t>1 Raja-raja 4:20–21</w:t>
+      </w:r>
+      <w:r>
+        <w:rPr>
+          <w:lang w:val="id_ID" w:bidi="id_ID"/>
+        </w:rPr>
+      </w:r>
+    </w:p>
+    <w:p>
+      <w:pPr/>
+      <w:r>
+        <w:rPr>
+          <w:lang w:val="id_ID" w:bidi="id_ID"/>
+        </w:rPr>
+      </w:r>
+      <w:r>
+        <w:rPr>
+          <w:lang w:val="id_ID" w:bidi="id_ID"/>
+        </w:rPr>
+        <w:t>Janji Allah kepada Abraham (</w:t>
+      </w:r>
+      <w:hyperlink r:id="rId156">
+        <w:r>
+          <w:rPr>
+            <w:lang w:val="id_ID" w:bidi="id_ID"/>
+          </w:rPr>
+          <w:rPr>
+            <w:color w:val="0000EE"/>
+            <w:u w:val="single"/>
+          </w:rPr>
+          <w:t>Kej. 15:18–21</w:t>
+        </w:r>
+      </w:hyperlink>
+      <w:r>
+        <w:rPr>
+          <w:lang w:val="id_ID" w:bidi="id_ID"/>
+        </w:rPr>
+        <w:t xml:space="preserve">; </w:t>
+      </w:r>
+      <w:hyperlink r:id="rId157">
+        <w:r>
+          <w:rPr>
+            <w:lang w:val="id_ID" w:bidi="id_ID"/>
+          </w:rPr>
+          <w:rPr>
+            <w:color w:val="0000EE"/>
+            <w:u w:val="single"/>
+          </w:rPr>
+          <w:t>17:8</w:t>
+        </w:r>
+      </w:hyperlink>
+      <w:r>
+        <w:rPr>
+          <w:lang w:val="id_ID" w:bidi="id_ID"/>
+        </w:rPr>
+        <w:t xml:space="preserve">; </w:t>
+      </w:r>
+      <w:hyperlink r:id="rId158">
+        <w:r>
+          <w:rPr>
+            <w:lang w:val="id_ID" w:bidi="id_ID"/>
+          </w:rPr>
+          <w:rPr>
+            <w:color w:val="0000EE"/>
+            <w:u w:val="single"/>
+          </w:rPr>
+          <w:t>22:17</w:t>
+        </w:r>
+      </w:hyperlink>
+      <w:r>
+        <w:rPr>
+          <w:lang w:val="id_ID" w:bidi="id_ID"/>
+        </w:rPr>
+        <w:t xml:space="preserve">) menemukan pemenuhan historis dalam berkat-Nya kepada Salomo. Tanah-tanah sekitarnya yang ditaklukkan oleh Daud dan </w:t>
+      </w:r>
+      <w:r>
+        <w:rPr>
+          <w:i/>
+          <w:lang w:val="id_ID" w:bidi="id_ID"/>
+        </w:rPr>
+        <w:t>Salomo</w:t>
+      </w:r>
+      <w:r>
+        <w:rPr>
+          <w:lang w:val="id_ID" w:bidi="id_ID"/>
+        </w:rPr>
+        <w:t xml:space="preserve"> (</w:t>
+      </w:r>
+      <w:hyperlink r:id="rId159">
+        <w:r>
+          <w:rPr>
+            <w:lang w:val="id_ID" w:bidi="id_ID"/>
+          </w:rPr>
+          <w:rPr>
+            <w:color w:val="0000EE"/>
+            <w:u w:val="single"/>
+          </w:rPr>
+          <w:t>2Taw. 8:3</w:t>
+        </w:r>
+      </w:hyperlink>
+      <w:r>
+        <w:rPr>
+          <w:lang w:val="id_ID" w:bidi="id_ID"/>
+        </w:rPr>
+        <w:t>) tetap setia kepada Salomo. Mereka mengirimkan upeti berupa uang . . . dan terus melayaninya sepanjang masa pemerintahannya yang panjang.</w:t>
+      </w:r>
+      <w:r>
+        <w:rPr>
+          <w:lang w:val="id_ID" w:bidi="id_ID"/>
+        </w:rPr>
+      </w:r>
+      <w:r>
+        <w:rPr>
+          <w:lang w:val="id_ID" w:bidi="id_ID"/>
+        </w:rPr>
+      </w:r>
+    </w:p>
+    <w:p>
+      <w:pPr/>
+      <w:r>
+        <w:rPr>
+          <w:lang w:val="id_ID" w:bidi="id_ID"/>
+        </w:rPr>
+      </w:r>
+    </w:p>
+    <w:p>
+      <w:pPr>
+        <w:pStyle w:val="Heading2"/>
+      </w:pPr>
+      <w:r>
+        <w:rPr>
+          <w:lang w:val="id_ID" w:bidi="id_ID"/>
+        </w:rPr>
+        <w:t>1 Raja-raja 4:22–23</w:t>
+      </w:r>
+      <w:r>
+        <w:rPr>
+          <w:lang w:val="id_ID" w:bidi="id_ID"/>
+        </w:rPr>
+      </w:r>
+    </w:p>
+    <w:p>
+      <w:pPr/>
+      <w:r>
+        <w:rPr>
+          <w:lang w:val="id_ID" w:bidi="id_ID"/>
+        </w:rPr>
+      </w:r>
+      <w:r>
+        <w:rPr>
+          <w:lang w:val="id_ID" w:bidi="id_ID"/>
+        </w:rPr>
+        <w:t>Istana Salomo sangat besar dan megah, seperti yang terlihat dari kebutuhan makanan hariannya.</w:t>
+      </w:r>
+      <w:r>
+        <w:rPr>
+          <w:lang w:val="id_ID" w:bidi="id_ID"/>
+        </w:rPr>
+      </w:r>
+      <w:r>
+        <w:rPr>
+          <w:lang w:val="id_ID" w:bidi="id_ID"/>
+        </w:rPr>
+      </w:r>
+    </w:p>
+    <w:p>
+      <w:pPr/>
+      <w:r>
+        <w:rPr>
+          <w:lang w:val="id_ID" w:bidi="id_ID"/>
+        </w:rPr>
+      </w:r>
+    </w:p>
+    <w:p>
+      <w:pPr>
+        <w:pStyle w:val="Heading2"/>
+      </w:pPr>
+      <w:r>
+        <w:rPr>
+          <w:lang w:val="id_ID" w:bidi="id_ID"/>
+        </w:rPr>
+        <w:t>1 Raja-raja 4:24–25</w:t>
+      </w:r>
+      <w:r>
+        <w:rPr>
+          <w:lang w:val="id_ID" w:bidi="id_ID"/>
+        </w:rPr>
+      </w:r>
+    </w:p>
+    <w:p>
+      <w:pPr/>
+      <w:r>
+        <w:rPr>
+          <w:lang w:val="id_ID" w:bidi="id_ID"/>
+        </w:rPr>
+      </w:r>
+      <w:r>
+        <w:rPr>
+          <w:lang w:val="id_ID" w:bidi="id_ID"/>
+        </w:rPr>
+        <w:t>Setiap keluarga memiliki rumah dan kebunnya sendiri: rakyat Salomo hidup dalam kondisi ideal yang menggambarkan era mesianik yang akan datang (</w:t>
+      </w:r>
+      <w:hyperlink r:id="rId160">
+        <w:r>
+          <w:rPr>
+            <w:lang w:val="id_ID" w:bidi="id_ID"/>
+          </w:rPr>
+          <w:rPr>
+            <w:color w:val="0000EE"/>
+            <w:u w:val="single"/>
+          </w:rPr>
+          <w:t>Mi. 4:4</w:t>
+        </w:r>
+      </w:hyperlink>
+      <w:r>
+        <w:rPr>
+          <w:lang w:val="id_ID" w:bidi="id_ID"/>
+        </w:rPr>
+        <w:t>), menikmati kemakmuran dan ketenangan yang melimpah.</w:t>
+      </w:r>
+      <w:r>
+        <w:rPr>
+          <w:lang w:val="id_ID" w:bidi="id_ID"/>
+        </w:rPr>
+      </w:r>
+      <w:r>
+        <w:rPr>
+          <w:lang w:val="id_ID" w:bidi="id_ID"/>
+        </w:rPr>
+      </w:r>
+    </w:p>
+    <w:p>
+      <w:pPr/>
+      <w:r>
+        <w:rPr>
+          <w:lang w:val="id_ID" w:bidi="id_ID"/>
+        </w:rPr>
+      </w:r>
+    </w:p>
+    <w:p>
+      <w:pPr>
+        <w:pStyle w:val="Heading2"/>
+      </w:pPr>
+      <w:r>
+        <w:rPr>
+          <w:lang w:val="id_ID" w:bidi="id_ID"/>
+        </w:rPr>
+        <w:t>1 Raja-raja 4:26</w:t>
+      </w:r>
+      <w:r>
+        <w:rPr>
+          <w:lang w:val="id_ID" w:bidi="id_ID"/>
+        </w:rPr>
+      </w:r>
+    </w:p>
+    <w:p>
+      <w:pPr/>
+      <w:r>
+        <w:rPr>
+          <w:lang w:val="id_ID" w:bidi="id_ID"/>
+        </w:rPr>
+      </w:r>
+      <w:r>
+        <w:rPr>
+          <w:lang w:val="id_ID" w:bidi="id_ID"/>
+        </w:rPr>
+        <w:t xml:space="preserve">4.000 kandang: Angka </w:t>
+      </w:r>
+      <w:r>
+        <w:rPr>
+          <w:i/>
+          <w:lang w:val="id_ID" w:bidi="id_ID"/>
+        </w:rPr>
+        <w:t>4.000</w:t>
+      </w:r>
+      <w:r>
+        <w:rPr>
+          <w:lang w:val="id_ID" w:bidi="id_ID"/>
+        </w:rPr>
+        <w:t xml:space="preserve"> mencerminkan teks paralel dalam </w:t>
+      </w:r>
+      <w:hyperlink r:id="rId161">
+        <w:r>
+          <w:rPr>
+            <w:lang w:val="id_ID" w:bidi="id_ID"/>
+          </w:rPr>
+          <w:rPr>
+            <w:color w:val="0000EE"/>
+            <w:u w:val="single"/>
+          </w:rPr>
+          <w:t>2Taw. 9:25</w:t>
+        </w:r>
+      </w:hyperlink>
+      <w:r>
+        <w:rPr>
+          <w:lang w:val="id_ID" w:bidi="id_ID"/>
+        </w:rPr>
+        <w:t>, jumlah yang sesuai untuk 1.400 kereta Salomo (</w:t>
+      </w:r>
+      <w:hyperlink r:id="rId162">
+        <w:r>
+          <w:rPr>
+            <w:lang w:val="id_ID" w:bidi="id_ID"/>
+          </w:rPr>
+          <w:rPr>
+            <w:color w:val="0000EE"/>
+            <w:u w:val="single"/>
+          </w:rPr>
+          <w:t>1Raj. 10:26</w:t>
+        </w:r>
+      </w:hyperlink>
+      <w:r>
+        <w:rPr>
+          <w:lang w:val="id_ID" w:bidi="id_ID"/>
+        </w:rPr>
+        <w:t xml:space="preserve">; </w:t>
+      </w:r>
+      <w:hyperlink r:id="rId163">
+        <w:r>
+          <w:rPr>
+            <w:lang w:val="id_ID" w:bidi="id_ID"/>
+          </w:rPr>
+          <w:rPr>
+            <w:color w:val="0000EE"/>
+            <w:u w:val="single"/>
+          </w:rPr>
+          <w:t>2Taw. 1:14</w:t>
+        </w:r>
+      </w:hyperlink>
+      <w:r>
+        <w:rPr>
+          <w:lang w:val="id_ID" w:bidi="id_ID"/>
+        </w:rPr>
+        <w:t>). • 12.000 kuda: Bahasa Ibraninya dapat diterjemahkan sebagai "penunggang kuda" (</w:t>
+      </w:r>
+      <w:hyperlink r:id="rId164">
+        <w:r>
+          <w:rPr>
+            <w:lang w:val="id_ID" w:bidi="id_ID"/>
+          </w:rPr>
+          <w:rPr>
+            <w:color w:val="0000EE"/>
+            <w:u w:val="single"/>
+          </w:rPr>
+          <w:t>Kel. 15:19–21</w:t>
+        </w:r>
+      </w:hyperlink>
+      <w:r>
+        <w:rPr>
+          <w:lang w:val="id_ID" w:bidi="id_ID"/>
+        </w:rPr>
+        <w:t>) atau "kuda-kuda" (</w:t>
+      </w:r>
+      <w:hyperlink r:id="rId165">
+        <w:r>
+          <w:rPr>
+            <w:lang w:val="id_ID" w:bidi="id_ID"/>
+          </w:rPr>
+          <w:rPr>
+            <w:color w:val="0000EE"/>
+            <w:u w:val="single"/>
+          </w:rPr>
+          <w:t>Yoel 2:4</w:t>
+        </w:r>
+      </w:hyperlink>
+      <w:r>
+        <w:rPr>
+          <w:lang w:val="id_ID" w:bidi="id_ID"/>
+        </w:rPr>
+        <w:t>). Untuk bersiap menghadapi pertempuran, Salomo membangun kota-kota untuk menampung pasukannya (</w:t>
+      </w:r>
+      <w:hyperlink r:id="rId166">
+        <w:r>
+          <w:rPr>
+            <w:lang w:val="id_ID" w:bidi="id_ID"/>
+          </w:rPr>
+          <w:rPr>
+            <w:color w:val="0000EE"/>
+            <w:u w:val="single"/>
+          </w:rPr>
+          <w:t>1Raj. 9:19</w:t>
+        </w:r>
+      </w:hyperlink>
+      <w:r>
+        <w:rPr>
+          <w:lang w:val="id_ID" w:bidi="id_ID"/>
+        </w:rPr>
+        <w:t>).</w:t>
+      </w:r>
+      <w:r>
+        <w:rPr>
+          <w:lang w:val="id_ID" w:bidi="id_ID"/>
+        </w:rPr>
+      </w:r>
+      <w:r>
+        <w:rPr>
+          <w:lang w:val="id_ID" w:bidi="id_ID"/>
+        </w:rPr>
+      </w:r>
+    </w:p>
+    <w:p>
+      <w:pPr/>
+      <w:r>
+        <w:rPr>
+          <w:lang w:val="id_ID" w:bidi="id_ID"/>
+        </w:rPr>
+      </w:r>
+    </w:p>
+    <w:p>
+      <w:pPr>
+        <w:pStyle w:val="Heading2"/>
+      </w:pPr>
+      <w:r>
+        <w:rPr>
+          <w:lang w:val="id_ID" w:bidi="id_ID"/>
+        </w:rPr>
+        <w:t>1 Raja-raja 4:29–30</w:t>
+      </w:r>
+      <w:r>
+        <w:rPr>
+          <w:lang w:val="id_ID" w:bidi="id_ID"/>
+        </w:rPr>
+      </w:r>
+    </w:p>
+    <w:p>
+      <w:pPr/>
+      <w:r>
+        <w:rPr>
+          <w:lang w:val="id_ID" w:bidi="id_ID"/>
+        </w:rPr>
+      </w:r>
+      <w:r>
+        <w:rPr>
+          <w:lang w:val="id_ID" w:bidi="id_ID"/>
+        </w:rPr>
+        <w:t>hikmat segala bani Timur: Babel terkenal dengan orang-orang bijaknya. Namun, kebijaksanaan yang diberikan Allah kepada Salomo (</w:t>
+      </w:r>
+      <w:hyperlink r:id="rId167">
+        <w:r>
+          <w:rPr>
+            <w:lang w:val="id_ID" w:bidi="id_ID"/>
+          </w:rPr>
+          <w:rPr>
+            <w:color w:val="0000EE"/>
+            <w:u w:val="single"/>
+          </w:rPr>
+          <w:t>1Raj. 3:9</w:t>
+        </w:r>
+      </w:hyperlink>
+      <w:r>
+        <w:rPr>
+          <w:lang w:val="id_ID" w:bidi="id_ID"/>
+        </w:rPr>
+        <w:t xml:space="preserve">, </w:t>
+      </w:r>
+      <w:hyperlink r:id="rId168">
+        <w:r>
+          <w:rPr>
+            <w:lang w:val="id_ID" w:bidi="id_ID"/>
+          </w:rPr>
+          <w:rPr>
+            <w:color w:val="0000EE"/>
+            <w:u w:val="single"/>
+          </w:rPr>
+          <w:t>12</w:t>
+        </w:r>
+      </w:hyperlink>
+      <w:r>
+        <w:rPr>
+          <w:lang w:val="id_ID" w:bidi="id_ID"/>
+        </w:rPr>
+        <w:t xml:space="preserve">, </w:t>
+      </w:r>
+      <w:hyperlink r:id="rId169">
+        <w:r>
+          <w:rPr>
+            <w:lang w:val="id_ID" w:bidi="id_ID"/>
+          </w:rPr>
+          <w:rPr>
+            <w:color w:val="0000EE"/>
+            <w:u w:val="single"/>
+          </w:rPr>
+          <w:t>28</w:t>
+        </w:r>
+      </w:hyperlink>
+      <w:r>
+        <w:rPr>
+          <w:lang w:val="id_ID" w:bidi="id_ID"/>
+        </w:rPr>
+        <w:t xml:space="preserve">; </w:t>
+      </w:r>
+      <w:hyperlink r:id="rId170">
+        <w:r>
+          <w:rPr>
+            <w:lang w:val="id_ID" w:bidi="id_ID"/>
+          </w:rPr>
+          <w:rPr>
+            <w:color w:val="0000EE"/>
+            <w:u w:val="single"/>
+          </w:rPr>
+          <w:t>Ams. 1:7</w:t>
+        </w:r>
+      </w:hyperlink>
+      <w:r>
+        <w:rPr>
+          <w:lang w:val="id_ID" w:bidi="id_ID"/>
+        </w:rPr>
+        <w:t xml:space="preserve">; </w:t>
+      </w:r>
+      <w:hyperlink r:id="rId171">
+        <w:r>
+          <w:rPr>
+            <w:lang w:val="id_ID" w:bidi="id_ID"/>
+          </w:rPr>
+          <w:rPr>
+            <w:color w:val="0000EE"/>
+            <w:u w:val="single"/>
+          </w:rPr>
+          <w:t>Pkh. 12:13</w:t>
+        </w:r>
+      </w:hyperlink>
+      <w:r>
+        <w:rPr>
+          <w:lang w:val="id_ID" w:bidi="id_ID"/>
+        </w:rPr>
+        <w:t>) melampaui semuanya (</w:t>
+      </w:r>
+      <w:hyperlink r:id="rId172">
+        <w:r>
+          <w:rPr>
+            <w:lang w:val="id_ID" w:bidi="id_ID"/>
+          </w:rPr>
+          <w:rPr>
+            <w:color w:val="0000EE"/>
+            <w:u w:val="single"/>
+          </w:rPr>
+          <w:t>1Raj. 4:34</w:t>
+        </w:r>
+      </w:hyperlink>
+      <w:r>
+        <w:rPr>
+          <w:lang w:val="id_ID" w:bidi="id_ID"/>
+        </w:rPr>
+        <w:t>).</w:t>
+      </w:r>
+      <w:r>
+        <w:rPr>
+          <w:lang w:val="id_ID" w:bidi="id_ID"/>
+        </w:rPr>
+      </w:r>
+      <w:r>
+        <w:rPr>
+          <w:lang w:val="id_ID" w:bidi="id_ID"/>
+        </w:rPr>
+      </w:r>
+    </w:p>
+    <w:p>
+      <w:pPr/>
+      <w:r>
+        <w:rPr>
+          <w:lang w:val="id_ID" w:bidi="id_ID"/>
+        </w:rPr>
+      </w:r>
+    </w:p>
+    <w:p>
+      <w:pPr>
+        <w:pStyle w:val="Heading2"/>
+      </w:pPr>
+      <w:r>
+        <w:rPr>
+          <w:lang w:val="id_ID" w:bidi="id_ID"/>
+        </w:rPr>
+        <w:t>1 Raja-raja 4:31</w:t>
+      </w:r>
+      <w:r>
+        <w:rPr>
+          <w:lang w:val="id_ID" w:bidi="id_ID"/>
+        </w:rPr>
+      </w:r>
+    </w:p>
+    <w:p>
+      <w:pPr/>
+      <w:r>
+        <w:rPr>
+          <w:lang w:val="id_ID" w:bidi="id_ID"/>
+        </w:rPr>
+      </w:r>
+      <w:r>
+        <w:rPr>
+          <w:lang w:val="id_ID" w:bidi="id_ID"/>
+        </w:rPr>
+        <w:t xml:space="preserve">Etan dan Heman adalah di antara musisi yang ditunjuk oleh Daud (lihat </w:t>
+      </w:r>
+      <w:hyperlink r:id="rId173">
+        <w:r>
+          <w:rPr>
+            <w:lang w:val="id_ID" w:bidi="id_ID"/>
+          </w:rPr>
+          <w:rPr>
+            <w:color w:val="0000EE"/>
+            <w:u w:val="single"/>
+          </w:rPr>
+          <w:t>1Taw. 6:33–47</w:t>
+        </w:r>
+      </w:hyperlink>
+      <w:r>
+        <w:rPr>
+          <w:lang w:val="id_ID" w:bidi="id_ID"/>
+        </w:rPr>
+        <w:t xml:space="preserve">; </w:t>
+      </w:r>
+      <w:hyperlink r:id="rId174">
+        <w:r>
+          <w:rPr>
+            <w:lang w:val="id_ID" w:bidi="id_ID"/>
+          </w:rPr>
+          <w:rPr>
+            <w:color w:val="0000EE"/>
+            <w:u w:val="single"/>
+          </w:rPr>
+          <w:t>15:16–19</w:t>
+        </w:r>
+      </w:hyperlink>
+      <w:r>
+        <w:rPr>
+          <w:lang w:val="id_ID" w:bidi="id_ID"/>
+        </w:rPr>
+        <w:t xml:space="preserve">; </w:t>
+      </w:r>
+      <w:hyperlink r:id="rId175">
+        <w:r>
+          <w:rPr>
+            <w:lang w:val="id_ID" w:bidi="id_ID"/>
+          </w:rPr>
+          <w:rPr>
+            <w:color w:val="0000EE"/>
+            <w:u w:val="single"/>
+          </w:rPr>
+          <w:t>Mzm. 88</w:t>
+        </w:r>
+      </w:hyperlink>
+      <w:r>
+        <w:rPr>
+          <w:lang w:val="id_ID" w:bidi="id_ID"/>
+        </w:rPr>
+        <w:t xml:space="preserve">, </w:t>
+      </w:r>
+      <w:hyperlink r:id="rId176">
+        <w:r>
+          <w:rPr>
+            <w:lang w:val="id_ID" w:bidi="id_ID"/>
+          </w:rPr>
+          <w:rPr>
+            <w:color w:val="0000EE"/>
+            <w:u w:val="single"/>
+          </w:rPr>
+          <w:t>89</w:t>
+        </w:r>
+      </w:hyperlink>
+      <w:r>
+        <w:rPr>
+          <w:lang w:val="id_ID" w:bidi="id_ID"/>
+        </w:rPr>
+        <w:t xml:space="preserve">). • Anak-anak Mahol adalah penyanyi di Bait Suci, sehingga Heman, Kalkol, dan Darda mungkin berpartisipasi dalam kebaktian (lihat </w:t>
+      </w:r>
+      <w:hyperlink r:id="rId177">
+        <w:r>
+          <w:rPr>
+            <w:lang w:val="id_ID" w:bidi="id_ID"/>
+          </w:rPr>
+          <w:rPr>
+            <w:color w:val="0000EE"/>
+            <w:u w:val="single"/>
+          </w:rPr>
+          <w:t>1Taw. 15:17</w:t>
+        </w:r>
+      </w:hyperlink>
+      <w:r>
+        <w:rPr>
+          <w:lang w:val="id_ID" w:bidi="id_ID"/>
+        </w:rPr>
+        <w:t xml:space="preserve">, </w:t>
+      </w:r>
+      <w:hyperlink r:id="rId178">
+        <w:r>
+          <w:rPr>
+            <w:lang w:val="id_ID" w:bidi="id_ID"/>
+          </w:rPr>
+          <w:rPr>
+            <w:color w:val="0000EE"/>
+            <w:u w:val="single"/>
+          </w:rPr>
+          <w:t>19–22</w:t>
+        </w:r>
+      </w:hyperlink>
+      <w:r>
+        <w:rPr>
+          <w:lang w:val="id_ID" w:bidi="id_ID"/>
+        </w:rPr>
+        <w:t>).</w:t>
+      </w:r>
+      <w:r>
+        <w:rPr>
+          <w:lang w:val="id_ID" w:bidi="id_ID"/>
+        </w:rPr>
+      </w:r>
+      <w:r>
+        <w:rPr>
+          <w:lang w:val="id_ID" w:bidi="id_ID"/>
+        </w:rPr>
+      </w:r>
+    </w:p>
+    <w:p>
+      <w:pPr/>
+      <w:r>
+        <w:rPr>
+          <w:lang w:val="id_ID" w:bidi="id_ID"/>
+        </w:rPr>
+      </w:r>
+    </w:p>
+    <w:p>
+      <w:pPr>
+        <w:pStyle w:val="Heading2"/>
+      </w:pPr>
+      <w:r>
+        <w:rPr>
+          <w:lang w:val="id_ID" w:bidi="id_ID"/>
+        </w:rPr>
+        <w:t>1 Raja-raja 4:32–34</w:t>
+      </w:r>
+      <w:r>
+        <w:rPr>
+          <w:lang w:val="id_ID" w:bidi="id_ID"/>
+        </w:rPr>
+      </w:r>
+    </w:p>
+    <w:p>
+      <w:pPr/>
+      <w:r>
+        <w:rPr>
+          <w:lang w:val="id_ID" w:bidi="id_ID"/>
+        </w:rPr>
+      </w:r>
+      <w:r>
+        <w:rPr>
+          <w:lang w:val="id_ID" w:bidi="id_ID"/>
+        </w:rPr>
+        <w:t xml:space="preserve">amsal . . . nyanyian: Salomo menulis banyak bagian dari Kitab Amsal dan menggubah </w:t>
+      </w:r>
+      <w:hyperlink r:id="rId179">
+        <w:r>
+          <w:rPr>
+            <w:lang w:val="id_ID" w:bidi="id_ID"/>
+          </w:rPr>
+          <w:rPr>
+            <w:color w:val="0000EE"/>
+            <w:u w:val="single"/>
+          </w:rPr>
+          <w:t>Mzm. 72</w:t>
+        </w:r>
+      </w:hyperlink>
+      <w:r>
+        <w:rPr>
+          <w:lang w:val="id_ID" w:bidi="id_ID"/>
+        </w:rPr>
+        <w:t xml:space="preserve"> dan </w:t>
+      </w:r>
+      <w:hyperlink r:id="rId180">
+        <w:r>
+          <w:rPr>
+            <w:lang w:val="id_ID" w:bidi="id_ID"/>
+          </w:rPr>
+          <w:rPr>
+            <w:color w:val="0000EE"/>
+            <w:u w:val="single"/>
+          </w:rPr>
+          <w:t>127</w:t>
+        </w:r>
+      </w:hyperlink>
+      <w:r>
+        <w:rPr>
+          <w:lang w:val="id_ID" w:bidi="id_ID"/>
+        </w:rPr>
+        <w:t xml:space="preserve">. Pengetahuannya tentang tumbuhan dan hewan mencerminkan pengamatannya yang cermat terhadap alam (lihat </w:t>
+      </w:r>
+      <w:hyperlink r:id="rId181">
+        <w:r>
+          <w:rPr>
+            <w:lang w:val="id_ID" w:bidi="id_ID"/>
+          </w:rPr>
+          <w:rPr>
+            <w:color w:val="0000EE"/>
+            <w:u w:val="single"/>
+          </w:rPr>
+          <w:t>Ams. 6:6–8</w:t>
+        </w:r>
+      </w:hyperlink>
+      <w:r>
+        <w:rPr>
+          <w:lang w:val="id_ID" w:bidi="id_ID"/>
+        </w:rPr>
+        <w:t xml:space="preserve">). Kebijaksanaan dan keunggulan sastra Salomo (lihat </w:t>
+      </w:r>
+      <w:hyperlink r:id="rId182">
+        <w:r>
+          <w:rPr>
+            <w:lang w:val="id_ID" w:bidi="id_ID"/>
+          </w:rPr>
+          <w:rPr>
+            <w:color w:val="0000EE"/>
+            <w:u w:val="single"/>
+          </w:rPr>
+          <w:t>Mat. 12:42</w:t>
+        </w:r>
+      </w:hyperlink>
+      <w:r>
+        <w:rPr>
+          <w:lang w:val="id_ID" w:bidi="id_ID"/>
+        </w:rPr>
+        <w:t>) tercermin dalam Kidung Agung dan Pengkhotbah. Tidak mengherankan banyak orang, termasuk raja-raja (</w:t>
+      </w:r>
+      <w:hyperlink r:id="rId183">
+        <w:r>
+          <w:rPr>
+            <w:lang w:val="id_ID" w:bidi="id_ID"/>
+          </w:rPr>
+          <w:rPr>
+            <w:color w:val="0000EE"/>
+            <w:u w:val="single"/>
+          </w:rPr>
+          <w:t>1Raj. 10:1–9</w:t>
+        </w:r>
+      </w:hyperlink>
+      <w:r>
+        <w:rPr>
+          <w:lang w:val="id_ID" w:bidi="id_ID"/>
+        </w:rPr>
+        <w:t>), mencari kebijaksanaan Salomo.</w:t>
+      </w:r>
+      <w:r>
+        <w:rPr>
+          <w:lang w:val="id_ID" w:bidi="id_ID"/>
+        </w:rPr>
+      </w:r>
+      <w:r>
+        <w:rPr>
+          <w:lang w:val="id_ID" w:bidi="id_ID"/>
+        </w:rPr>
+      </w:r>
+    </w:p>
+    <w:p>
+      <w:pPr/>
+      <w:r>
+        <w:rPr>
+          <w:lang w:val="id_ID" w:bidi="id_ID"/>
+        </w:rPr>
+      </w:r>
+    </w:p>
+    <w:p>
+      <w:pPr>
+        <w:pStyle w:val="Heading2"/>
+      </w:pPr>
+      <w:r>
+        <w:rPr>
+          <w:lang w:val="id_ID" w:bidi="id_ID"/>
+        </w:rPr>
+        <w:t>1 Raja-raja 5:1–18</w:t>
+      </w:r>
+      <w:r>
+        <w:rPr>
+          <w:lang w:val="id_ID" w:bidi="id_ID"/>
+        </w:rPr>
+      </w:r>
+    </w:p>
+    <w:p>
+      <w:pPr/>
+      <w:r>
+        <w:rPr>
+          <w:lang w:val="id_ID" w:bidi="id_ID"/>
+        </w:rPr>
+      </w:r>
+      <w:r>
+        <w:rPr>
+          <w:lang w:val="id_ID" w:bidi="id_ID"/>
+        </w:rPr>
+        <w:t>Raja Hiram dari Tirus telah menjadi teman setia Daud (</w:t>
+      </w:r>
+      <w:hyperlink r:id="rId184">
+        <w:r>
+          <w:rPr>
+            <w:lang w:val="id_ID" w:bidi="id_ID"/>
+          </w:rPr>
+          <w:rPr>
+            <w:color w:val="0000EE"/>
+            <w:u w:val="single"/>
+          </w:rPr>
+          <w:t>2Sam. 5:11–12</w:t>
+        </w:r>
+      </w:hyperlink>
+      <w:r>
+        <w:rPr>
+          <w:lang w:val="id_ID" w:bidi="id_ID"/>
+        </w:rPr>
+        <w:t>). Ini mungkin menunjukkan bahwa keduanya memiliki hubungan perjanjian. Hiram adalah sekutu dan mitra dagang yang berharga (</w:t>
+      </w:r>
+      <w:hyperlink r:id="rId185">
+        <w:r>
+          <w:rPr>
+            <w:lang w:val="id_ID" w:bidi="id_ID"/>
+          </w:rPr>
+          <w:rPr>
+            <w:color w:val="0000EE"/>
+            <w:u w:val="single"/>
+          </w:rPr>
+          <w:t>1Raj. 5:7–11</w:t>
+        </w:r>
+      </w:hyperlink>
+      <w:r>
+        <w:rPr>
+          <w:lang w:val="id_ID" w:bidi="id_ID"/>
+        </w:rPr>
+        <w:t xml:space="preserve">, </w:t>
+      </w:r>
+      <w:hyperlink r:id="rId186">
+        <w:r>
+          <w:rPr>
+            <w:lang w:val="id_ID" w:bidi="id_ID"/>
+          </w:rPr>
+          <w:rPr>
+            <w:color w:val="0000EE"/>
+            <w:u w:val="single"/>
+          </w:rPr>
+          <w:t>18</w:t>
+        </w:r>
+      </w:hyperlink>
+      <w:r>
+        <w:rPr>
+          <w:lang w:val="id_ID" w:bidi="id_ID"/>
+        </w:rPr>
+        <w:t xml:space="preserve">; </w:t>
+      </w:r>
+      <w:hyperlink r:id="rId187">
+        <w:r>
+          <w:rPr>
+            <w:lang w:val="id_ID" w:bidi="id_ID"/>
+          </w:rPr>
+          <w:rPr>
+            <w:color w:val="0000EE"/>
+            <w:u w:val="single"/>
+          </w:rPr>
+          <w:t>9:11</w:t>
+        </w:r>
+      </w:hyperlink>
+      <w:r>
+        <w:rPr>
+          <w:lang w:val="id_ID" w:bidi="id_ID"/>
+        </w:rPr>
+        <w:t xml:space="preserve">, </w:t>
+      </w:r>
+      <w:hyperlink r:id="rId188">
+        <w:r>
+          <w:rPr>
+            <w:lang w:val="id_ID" w:bidi="id_ID"/>
+          </w:rPr>
+          <w:rPr>
+            <w:color w:val="0000EE"/>
+            <w:u w:val="single"/>
+          </w:rPr>
+          <w:t>26–28</w:t>
+        </w:r>
+      </w:hyperlink>
+      <w:r>
+        <w:rPr>
+          <w:lang w:val="id_ID" w:bidi="id_ID"/>
+        </w:rPr>
+        <w:t xml:space="preserve">; </w:t>
+      </w:r>
+      <w:hyperlink r:id="rId189">
+        <w:r>
+          <w:rPr>
+            <w:lang w:val="id_ID" w:bidi="id_ID"/>
+          </w:rPr>
+          <w:rPr>
+            <w:color w:val="0000EE"/>
+            <w:u w:val="single"/>
+          </w:rPr>
+          <w:t>10:22</w:t>
+        </w:r>
+      </w:hyperlink>
+      <w:r>
+        <w:rPr>
+          <w:lang w:val="id_ID" w:bidi="id_ID"/>
+        </w:rPr>
+        <w:t>). Namanya adalah bentuk singkat dari Ahiram, sebuah nama yang ditemukan di tempat lain dalam prasasti Fenisia.</w:t>
+      </w:r>
+      <w:r>
+        <w:rPr>
+          <w:lang w:val="id_ID" w:bidi="id_ID"/>
+        </w:rPr>
+      </w:r>
+      <w:r>
+        <w:rPr>
+          <w:lang w:val="id_ID" w:bidi="id_ID"/>
+        </w:rPr>
+      </w:r>
+    </w:p>
+    <w:p>
+      <w:pPr/>
+      <w:r>
+        <w:rPr>
+          <w:lang w:val="id_ID" w:bidi="id_ID"/>
+        </w:rPr>
+      </w:r>
+    </w:p>
+    <w:p>
+      <w:pPr>
+        <w:pStyle w:val="Heading2"/>
+      </w:pPr>
+      <w:r>
+        <w:rPr>
+          <w:lang w:val="id_ID" w:bidi="id_ID"/>
+        </w:rPr>
+        <w:t>1 Raja-raja 5:2–6</w:t>
+      </w:r>
+      <w:r>
+        <w:rPr>
+          <w:lang w:val="id_ID" w:bidi="id_ID"/>
+        </w:rPr>
+      </w:r>
+    </w:p>
+    <w:p>
+      <w:pPr/>
+      <w:r>
+        <w:rPr>
+          <w:lang w:val="id_ID" w:bidi="id_ID"/>
+        </w:rPr>
+      </w:r>
+      <w:r>
+        <w:rPr>
+          <w:lang w:val="id_ID" w:bidi="id_ID"/>
+        </w:rPr>
+        <w:t>Salomo menanggapi Hiram dengan mengirim pesan melalui duta-duta Hiram bahwa ia bermaksud membangun sebuah Bait untuk menghormati nama Tuhan, sesuai dengan keinginan dan persiapan ayahnya, Daud, untuk pembangunannya (</w:t>
+      </w:r>
+      <w:hyperlink r:id="rId190">
+        <w:r>
+          <w:rPr>
+            <w:lang w:val="id_ID" w:bidi="id_ID"/>
+          </w:rPr>
+          <w:rPr>
+            <w:color w:val="0000EE"/>
+            <w:u w:val="single"/>
+          </w:rPr>
+          <w:t>2Sam. 7:1–3</w:t>
+        </w:r>
+      </w:hyperlink>
+      <w:r>
+        <w:rPr>
+          <w:lang w:val="id_ID" w:bidi="id_ID"/>
+        </w:rPr>
+        <w:t xml:space="preserve">; </w:t>
+      </w:r>
+      <w:hyperlink r:id="rId191">
+        <w:r>
+          <w:rPr>
+            <w:lang w:val="id_ID" w:bidi="id_ID"/>
+          </w:rPr>
+          <w:rPr>
+            <w:color w:val="0000EE"/>
+            <w:u w:val="single"/>
+          </w:rPr>
+          <w:t>1Taw. 17:1–15</w:t>
+        </w:r>
+      </w:hyperlink>
+      <w:r>
+        <w:rPr>
+          <w:lang w:val="id_ID" w:bidi="id_ID"/>
+        </w:rPr>
+        <w:t xml:space="preserve">; </w:t>
+      </w:r>
+      <w:hyperlink r:id="rId192">
+        <w:r>
+          <w:rPr>
+            <w:lang w:val="id_ID" w:bidi="id_ID"/>
+          </w:rPr>
+          <w:rPr>
+            <w:color w:val="0000EE"/>
+            <w:u w:val="single"/>
+          </w:rPr>
+          <w:t>22:14–19</w:t>
+        </w:r>
+      </w:hyperlink>
+      <w:r>
+        <w:rPr>
+          <w:lang w:val="id_ID" w:bidi="id_ID"/>
+        </w:rPr>
+        <w:t xml:space="preserve">; </w:t>
+      </w:r>
+      <w:hyperlink r:id="rId193">
+        <w:r>
+          <w:rPr>
+            <w:lang w:val="id_ID" w:bidi="id_ID"/>
+          </w:rPr>
+          <w:rPr>
+            <w:color w:val="0000EE"/>
+            <w:u w:val="single"/>
+          </w:rPr>
+          <w:t>28:9–12</w:t>
+        </w:r>
+      </w:hyperlink>
+      <w:r>
+        <w:rPr>
+          <w:lang w:val="id_ID" w:bidi="id_ID"/>
+        </w:rPr>
+        <w:t>).</w:t>
+      </w:r>
+      <w:r>
+        <w:rPr>
+          <w:lang w:val="id_ID" w:bidi="id_ID"/>
+        </w:rPr>
+      </w:r>
+      <w:r>
+        <w:rPr>
+          <w:lang w:val="id_ID" w:bidi="id_ID"/>
+        </w:rPr>
+      </w:r>
+    </w:p>
+    <w:p>
+      <w:pPr/>
+      <w:r>
+        <w:rPr>
+          <w:lang w:val="id_ID" w:bidi="id_ID"/>
+        </w:rPr>
+      </w:r>
+    </w:p>
+    <w:p>
+      <w:pPr>
+        <w:pStyle w:val="Heading2"/>
+      </w:pPr>
+      <w:r>
+        <w:rPr>
+          <w:lang w:val="id_ID" w:bidi="id_ID"/>
+        </w:rPr>
+        <w:t>1 Raja-raja 5:3</w:t>
+      </w:r>
+      <w:r>
+        <w:rPr>
+          <w:lang w:val="id_ID" w:bidi="id_ID"/>
+        </w:rPr>
+      </w:r>
+    </w:p>
+    <w:p>
+      <w:pPr/>
+      <w:r>
+        <w:rPr>
+          <w:lang w:val="id_ID" w:bidi="id_ID"/>
+        </w:rPr>
+      </w:r>
+      <w:r>
+        <w:rPr>
+          <w:lang w:val="id_ID" w:bidi="id_ID"/>
+        </w:rPr>
+        <w:t xml:space="preserve">memberikan kemenangan atas semua musuhnya (secara harfiah </w:t>
+      </w:r>
+      <w:r>
+        <w:rPr>
+          <w:i/>
+          <w:lang w:val="id_ID" w:bidi="id_ID"/>
+        </w:rPr>
+        <w:t>menyerahkan mereka ke bawah telapak kakinya</w:t>
+      </w:r>
+      <w:r>
+        <w:rPr>
+          <w:lang w:val="id_ID" w:bidi="id_ID"/>
+        </w:rPr>
+        <w:t>): Prasasti dan lukisan dari Timur Dekat kuno sering menggambarkan raja-raja yang menang dengan kaki mereka di atas leher musuh yang telah dikalahkan atau dengan musuh yang ditundukkan di kaki mereka.</w:t>
+      </w:r>
+      <w:r>
+        <w:rPr>
+          <w:lang w:val="id_ID" w:bidi="id_ID"/>
+        </w:rPr>
+      </w:r>
+      <w:r>
+        <w:rPr>
+          <w:lang w:val="id_ID" w:bidi="id_ID"/>
+        </w:rPr>
+      </w:r>
+    </w:p>
+    <w:p>
+      <w:pPr/>
+      <w:r>
+        <w:rPr>
+          <w:lang w:val="id_ID" w:bidi="id_ID"/>
+        </w:rPr>
+      </w:r>
+    </w:p>
+    <w:p>
+      <w:pPr>
+        <w:pStyle w:val="Heading2"/>
+      </w:pPr>
+      <w:r>
+        <w:rPr>
+          <w:lang w:val="id_ID" w:bidi="id_ID"/>
+        </w:rPr>
+        <w:t>1 Raja-raja 5:4–5</w:t>
+      </w:r>
+      <w:r>
+        <w:rPr>
+          <w:lang w:val="id_ID" w:bidi="id_ID"/>
+        </w:rPr>
+      </w:r>
+    </w:p>
+    <w:p>
+      <w:pPr/>
+      <w:r>
+        <w:rPr>
+          <w:lang w:val="id_ID" w:bidi="id_ID"/>
+        </w:rPr>
+      </w:r>
+      <w:r>
+        <w:rPr>
+          <w:lang w:val="id_ID" w:bidi="id_ID"/>
+        </w:rPr>
+        <w:t xml:space="preserve">Tidak seperti Daud, Salomo menikmati kedamaian [secara harfiah </w:t>
+      </w:r>
+      <w:r>
+        <w:rPr>
+          <w:i/>
+          <w:lang w:val="id_ID" w:bidi="id_ID"/>
+        </w:rPr>
+        <w:t>istirahat</w:t>
+      </w:r>
+      <w:r>
+        <w:rPr>
+          <w:lang w:val="id_ID" w:bidi="id_ID"/>
+        </w:rPr>
+        <w:t xml:space="preserve">] di setiap sisi. Nama Salomo (Ibrani </w:t>
+      </w:r>
+      <w:r>
+        <w:rPr>
+          <w:i/>
+          <w:lang w:val="id_ID" w:bidi="id_ID"/>
+        </w:rPr>
+        <w:t>shlomoh</w:t>
+      </w:r>
+      <w:r>
+        <w:rPr>
+          <w:lang w:val="id_ID" w:bidi="id_ID"/>
+        </w:rPr>
+        <w:t xml:space="preserve">) mungkin merupakan variasi dari kata untuk “damai” (Ibrani </w:t>
+      </w:r>
+      <w:r>
+        <w:rPr>
+          <w:i/>
+          <w:lang w:val="id_ID" w:bidi="id_ID"/>
+        </w:rPr>
+        <w:t>shalom</w:t>
+      </w:r>
+      <w:r>
+        <w:rPr>
+          <w:lang w:val="id_ID" w:bidi="id_ID"/>
+        </w:rPr>
+        <w:t xml:space="preserve">). • Nama Tuhan menunjukkan karakter dan reputasi Allah yang diungkapkan sendiri. Istilah Ibrani yang diterjemahkan sebagai </w:t>
+      </w:r>
+      <w:r>
+        <w:rPr>
+          <w:i/>
+          <w:lang w:val="id_ID" w:bidi="id_ID"/>
+        </w:rPr>
+        <w:t>nama</w:t>
+      </w:r>
+      <w:r>
+        <w:rPr>
+          <w:lang w:val="id_ID" w:bidi="id_ID"/>
+        </w:rPr>
+        <w:t xml:space="preserve"> kadang-kadang digunakan dalam pembacaan lisan Kitab Suci agar pembaca dapat menghindari menyebut nama pribadi Allah (tetragramaton—YHWH). Perjanjian Baru menerapkan istilah “nama” kepada Yesus (</w:t>
+      </w:r>
+      <w:hyperlink r:id="rId194">
+        <w:r>
+          <w:rPr>
+            <w:lang w:val="id_ID" w:bidi="id_ID"/>
+          </w:rPr>
+          <w:rPr>
+            <w:color w:val="0000EE"/>
+            <w:u w:val="single"/>
+          </w:rPr>
+          <w:t>Kisah 5:41</w:t>
+        </w:r>
+      </w:hyperlink>
+      <w:r>
+        <w:rPr>
+          <w:lang w:val="id_ID" w:bidi="id_ID"/>
+        </w:rPr>
+        <w:t xml:space="preserve">; </w:t>
+      </w:r>
+      <w:hyperlink r:id="rId195">
+        <w:r>
+          <w:rPr>
+            <w:lang w:val="id_ID" w:bidi="id_ID"/>
+          </w:rPr>
+          <w:rPr>
+            <w:color w:val="0000EE"/>
+            <w:u w:val="single"/>
+          </w:rPr>
+          <w:t>3 Yoh. 1:7</w:t>
+        </w:r>
+      </w:hyperlink>
+      <w:r>
+        <w:rPr>
+          <w:lang w:val="id_ID" w:bidi="id_ID"/>
+        </w:rPr>
+        <w:t>).</w:t>
+      </w:r>
+      <w:r>
+        <w:rPr>
+          <w:lang w:val="id_ID" w:bidi="id_ID"/>
+        </w:rPr>
+      </w:r>
+      <w:r>
+        <w:rPr>
+          <w:lang w:val="id_ID" w:bidi="id_ID"/>
+        </w:rPr>
+      </w:r>
+    </w:p>
+    <w:p>
+      <w:pPr/>
+      <w:r>
+        <w:rPr>
+          <w:lang w:val="id_ID" w:bidi="id_ID"/>
+        </w:rPr>
+      </w:r>
+    </w:p>
+    <w:p>
+      <w:pPr>
+        <w:pStyle w:val="Heading2"/>
+      </w:pPr>
+      <w:r>
+        <w:rPr>
+          <w:lang w:val="id_ID" w:bidi="id_ID"/>
+        </w:rPr>
+        <w:t>1 Raja-raja 5:6</w:t>
+      </w:r>
+      <w:r>
+        <w:rPr>
+          <w:lang w:val="id_ID" w:bidi="id_ID"/>
+        </w:rPr>
+      </w:r>
+    </w:p>
+    <w:p>
+      <w:pPr/>
+      <w:r>
+        <w:rPr>
+          <w:lang w:val="id_ID" w:bidi="id_ID"/>
+        </w:rPr>
+      </w:r>
+      <w:r>
+        <w:rPr>
+          <w:lang w:val="id_ID" w:bidi="id_ID"/>
+        </w:rPr>
+        <w:t xml:space="preserve">perintahkanlah: Inti utama dari pesan Salomo adalah permintaannya untuk kayu aras dari Libanon, yang menunjukkan pengaruh komersial luas Hiram. Sastra Timur Dekat kuno sering menyebut penggunaan kayu </w:t>
+      </w:r>
+      <w:r>
+        <w:rPr>
+          <w:i/>
+          <w:lang w:val="id_ID" w:bidi="id_ID"/>
+        </w:rPr>
+        <w:t>aras</w:t>
+      </w:r>
+      <w:r>
+        <w:rPr>
+          <w:lang w:val="id_ID" w:bidi="id_ID"/>
+        </w:rPr>
+        <w:t xml:space="preserve"> Libanon dalam pembangunan dan perabotan kuil serta istana. • Sidon adalah nama umum untuk orang Fenisia; Sidon lebih kuno daripada Tirus.</w:t>
+      </w:r>
+      <w:r>
+        <w:rPr>
+          <w:lang w:val="id_ID" w:bidi="id_ID"/>
+        </w:rPr>
+      </w:r>
+      <w:r>
+        <w:rPr>
+          <w:lang w:val="id_ID" w:bidi="id_ID"/>
+        </w:rPr>
+      </w:r>
+    </w:p>
+    <w:p>
+      <w:pPr/>
+      <w:r>
+        <w:rPr>
+          <w:lang w:val="id_ID" w:bidi="id_ID"/>
+        </w:rPr>
+      </w:r>
+    </w:p>
+    <w:p>
+      <w:pPr>
+        <w:pStyle w:val="Heading2"/>
+      </w:pPr>
+      <w:r>
+        <w:rPr>
+          <w:lang w:val="id_ID" w:bidi="id_ID"/>
+        </w:rPr>
+        <w:t>1 Raja-raja 5:7</w:t>
+      </w:r>
+      <w:r>
+        <w:rPr>
+          <w:lang w:val="id_ID" w:bidi="id_ID"/>
+        </w:rPr>
+      </w:r>
+    </w:p>
+    <w:p>
+      <w:pPr/>
+      <w:r>
+        <w:rPr>
+          <w:lang w:val="id_ID" w:bidi="id_ID"/>
+        </w:rPr>
+      </w:r>
+      <w:r>
+        <w:rPr>
+          <w:lang w:val="id_ID" w:bidi="id_ID"/>
+        </w:rPr>
+        <w:t xml:space="preserve">Terpujilah Tuhan: Hiram tidak mengakui Allah Israel sebagai Tuhannya, tetapi, mengikuti protokol Timur Dekat kuno, ia dengan sopan mengakui Allah Salomo (lihat </w:t>
+      </w:r>
+      <w:hyperlink r:id="rId196">
+        <w:r>
+          <w:rPr>
+            <w:lang w:val="id_ID" w:bidi="id_ID"/>
+          </w:rPr>
+          <w:rPr>
+            <w:color w:val="0000EE"/>
+            <w:u w:val="single"/>
+          </w:rPr>
+          <w:t>1Raj. 10:9</w:t>
+        </w:r>
+      </w:hyperlink>
+      <w:r>
+        <w:rPr>
+          <w:lang w:val="id_ID" w:bidi="id_ID"/>
+        </w:rPr>
+        <w:t xml:space="preserve">; </w:t>
+      </w:r>
+      <w:hyperlink r:id="rId197">
+        <w:r>
+          <w:rPr>
+            <w:lang w:val="id_ID" w:bidi="id_ID"/>
+          </w:rPr>
+          <w:rPr>
+            <w:color w:val="0000EE"/>
+            <w:u w:val="single"/>
+          </w:rPr>
+          <w:t>2Raj. 18:22–25</w:t>
+        </w:r>
+      </w:hyperlink>
+      <w:r>
+        <w:rPr>
+          <w:lang w:val="id_ID" w:bidi="id_ID"/>
+        </w:rPr>
+        <w:t xml:space="preserve">; </w:t>
+      </w:r>
+      <w:hyperlink r:id="rId198">
+        <w:r>
+          <w:rPr>
+            <w:lang w:val="id_ID" w:bidi="id_ID"/>
+          </w:rPr>
+          <w:rPr>
+            <w:color w:val="0000EE"/>
+            <w:u w:val="single"/>
+          </w:rPr>
+          <w:t>Ezra 1:2–4</w:t>
+        </w:r>
+      </w:hyperlink>
+      <w:r>
+        <w:rPr>
+          <w:lang w:val="id_ID" w:bidi="id_ID"/>
+        </w:rPr>
+        <w:t xml:space="preserve">; </w:t>
+      </w:r>
+      <w:hyperlink r:id="rId199">
+        <w:r>
+          <w:rPr>
+            <w:lang w:val="id_ID" w:bidi="id_ID"/>
+          </w:rPr>
+          <w:rPr>
+            <w:color w:val="0000EE"/>
+            <w:u w:val="single"/>
+          </w:rPr>
+          <w:t>6:12</w:t>
+        </w:r>
+      </w:hyperlink>
+      <w:r>
+        <w:rPr>
+          <w:lang w:val="id_ID" w:bidi="id_ID"/>
+        </w:rPr>
+        <w:t xml:space="preserve">; </w:t>
+      </w:r>
+      <w:hyperlink r:id="rId200">
+        <w:r>
+          <w:rPr>
+            <w:lang w:val="id_ID" w:bidi="id_ID"/>
+          </w:rPr>
+          <w:rPr>
+            <w:color w:val="0000EE"/>
+            <w:u w:val="single"/>
+          </w:rPr>
+          <w:t>Dan. 2:47</w:t>
+        </w:r>
+      </w:hyperlink>
+      <w:r>
+        <w:rPr>
+          <w:lang w:val="id_ID" w:bidi="id_ID"/>
+        </w:rPr>
+        <w:t xml:space="preserve">; </w:t>
+      </w:r>
+      <w:hyperlink r:id="rId201">
+        <w:r>
+          <w:rPr>
+            <w:lang w:val="id_ID" w:bidi="id_ID"/>
+          </w:rPr>
+          <w:rPr>
+            <w:color w:val="0000EE"/>
+            <w:u w:val="single"/>
+          </w:rPr>
+          <w:t>3:29</w:t>
+        </w:r>
+      </w:hyperlink>
+      <w:r>
+        <w:rPr>
+          <w:lang w:val="id_ID" w:bidi="id_ID"/>
+        </w:rPr>
+        <w:t xml:space="preserve">; </w:t>
+      </w:r>
+      <w:hyperlink r:id="rId202">
+        <w:r>
+          <w:rPr>
+            <w:lang w:val="id_ID" w:bidi="id_ID"/>
+          </w:rPr>
+          <w:rPr>
+            <w:color w:val="0000EE"/>
+            <w:u w:val="single"/>
+          </w:rPr>
+          <w:t>6:26–27</w:t>
+        </w:r>
+      </w:hyperlink>
+      <w:r>
+        <w:rPr>
+          <w:lang w:val="id_ID" w:bidi="id_ID"/>
+        </w:rPr>
+        <w:t>).</w:t>
+      </w:r>
+      <w:r>
+        <w:rPr>
+          <w:lang w:val="id_ID" w:bidi="id_ID"/>
+        </w:rPr>
+      </w:r>
+      <w:r>
+        <w:rPr>
+          <w:lang w:val="id_ID" w:bidi="id_ID"/>
+        </w:rPr>
+      </w:r>
+    </w:p>
+    <w:p>
+      <w:pPr/>
+      <w:r>
+        <w:rPr>
+          <w:lang w:val="id_ID" w:bidi="id_ID"/>
+        </w:rPr>
+      </w:r>
+    </w:p>
+    <w:p>
+      <w:pPr>
+        <w:pStyle w:val="Heading2"/>
+      </w:pPr>
+      <w:r>
+        <w:rPr>
+          <w:lang w:val="id_ID" w:bidi="id_ID"/>
+        </w:rPr>
+        <w:t>1 Raja-raja 5:7–12</w:t>
+      </w:r>
+      <w:r>
+        <w:rPr>
+          <w:lang w:val="id_ID" w:bidi="id_ID"/>
+        </w:rPr>
+      </w:r>
+    </w:p>
+    <w:p>
+      <w:pPr/>
+      <w:r>
+        <w:rPr>
+          <w:lang w:val="id_ID" w:bidi="id_ID"/>
+        </w:rPr>
+      </w:r>
+      <w:r>
+        <w:rPr>
+          <w:lang w:val="id_ID" w:bidi="id_ID"/>
+        </w:rPr>
+        <w:t>Balasan Hiram kepada Salomo menegaskan dan memperkuat hubungan baik yang dimilikinya dengan Daud. Usaha ini saling menguntungkan. Salomo menerima bahan bangunan yang diperlukan untuk Bait Suci; sebagai imbalannya, ia menyediakan kebutuhan rumah tangga Hiram (</w:t>
+      </w:r>
+      <w:hyperlink r:id="rId203">
+        <w:r>
+          <w:rPr>
+            <w:lang w:val="id_ID" w:bidi="id_ID"/>
+          </w:rPr>
+          <w:rPr>
+            <w:color w:val="0000EE"/>
+            <w:u w:val="single"/>
+          </w:rPr>
+          <w:t>1Raj. 5:9–10</w:t>
+        </w:r>
+      </w:hyperlink>
+      <w:r>
+        <w:rPr>
+          <w:lang w:val="id_ID" w:bidi="id_ID"/>
+        </w:rPr>
+        <w:t>) dan membayar pekerja Hiram (</w:t>
+      </w:r>
+      <w:hyperlink r:id="rId204">
+        <w:r>
+          <w:rPr>
+            <w:lang w:val="id_ID" w:bidi="id_ID"/>
+          </w:rPr>
+          <w:rPr>
+            <w:color w:val="0000EE"/>
+            <w:u w:val="single"/>
+          </w:rPr>
+          <w:t>1Raj. 5:6</w:t>
+        </w:r>
+      </w:hyperlink>
+      <w:r>
+        <w:rPr>
+          <w:lang w:val="id_ID" w:bidi="id_ID"/>
+        </w:rPr>
+        <w:t>). Bagian ini menggambarkan keterampilan usaha komersial orang Fenisia dan kekayaan besar Salomo, serta sekali lagi menekankan kebijaksanaan yang diberikan Allah kepada Salomo. Usaha yang sebagian besar bersifat komersial ini mengarah pada aliansi perdamaian formal (</w:t>
+      </w:r>
+      <w:hyperlink r:id="rId205">
+        <w:r>
+          <w:rPr>
+            <w:lang w:val="id_ID" w:bidi="id_ID"/>
+          </w:rPr>
+          <w:rPr>
+            <w:color w:val="0000EE"/>
+            <w:u w:val="single"/>
+          </w:rPr>
+          <w:t>1Raj. 5:12</w:t>
+        </w:r>
+      </w:hyperlink>
+      <w:r>
+        <w:rPr>
+          <w:lang w:val="id_ID" w:bidi="id_ID"/>
+        </w:rPr>
+        <w:t>).</w:t>
+      </w:r>
+      <w:r>
+        <w:rPr>
+          <w:lang w:val="id_ID" w:bidi="id_ID"/>
+        </w:rPr>
+      </w:r>
+      <w:r>
+        <w:rPr>
+          <w:lang w:val="id_ID" w:bidi="id_ID"/>
+        </w:rPr>
+      </w:r>
+    </w:p>
+    <w:p>
+      <w:pPr/>
+      <w:r>
+        <w:rPr>
+          <w:lang w:val="id_ID" w:bidi="id_ID"/>
+        </w:rPr>
+      </w:r>
+    </w:p>
+    <w:p>
+      <w:pPr>
+        <w:pStyle w:val="Heading2"/>
+      </w:pPr>
+      <w:r>
+        <w:rPr>
+          <w:lang w:val="id_ID" w:bidi="id_ID"/>
+        </w:rPr>
+        <w:t>1 Raja-raja 5:13</w:t>
+      </w:r>
+      <w:r>
+        <w:rPr>
+          <w:lang w:val="id_ID" w:bidi="id_ID"/>
+        </w:rPr>
+      </w:r>
+    </w:p>
+    <w:p>
+      <w:pPr/>
+      <w:r>
+        <w:rPr>
+          <w:lang w:val="id_ID" w:bidi="id_ID"/>
+        </w:rPr>
+      </w:r>
+      <w:r>
+        <w:rPr>
+          <w:lang w:val="id_ID" w:bidi="id_ID"/>
+        </w:rPr>
+        <w:t>Orang asing dengan izin tinggal permanen di Israel merupakan sebagian besar tenaga kerja Salomo. Penduduk asli Israel tampaknya berperan sebagai pengawas sementara untuk proyek pembangunan Salomo (</w:t>
+      </w:r>
+      <w:hyperlink r:id="rId206">
+        <w:r>
+          <w:rPr>
+            <w:lang w:val="id_ID" w:bidi="id_ID"/>
+          </w:rPr>
+          <w:rPr>
+            <w:color w:val="0000EE"/>
+            <w:u w:val="single"/>
+          </w:rPr>
+          <w:t>1Raj. 9:22–23</w:t>
+        </w:r>
+      </w:hyperlink>
+      <w:r>
+        <w:rPr>
+          <w:lang w:val="id_ID" w:bidi="id_ID"/>
+        </w:rPr>
+        <w:t xml:space="preserve">; </w:t>
+      </w:r>
+      <w:hyperlink r:id="rId207">
+        <w:r>
+          <w:rPr>
+            <w:lang w:val="id_ID" w:bidi="id_ID"/>
+          </w:rPr>
+          <w:rPr>
+            <w:color w:val="0000EE"/>
+            <w:u w:val="single"/>
+          </w:rPr>
+          <w:t>11:28</w:t>
+        </w:r>
+      </w:hyperlink>
+      <w:r>
+        <w:rPr>
+          <w:lang w:val="id_ID" w:bidi="id_ID"/>
+        </w:rPr>
+        <w:t>).</w:t>
+      </w:r>
+      <w:r>
+        <w:rPr>
+          <w:lang w:val="id_ID" w:bidi="id_ID"/>
+        </w:rPr>
+      </w:r>
+      <w:r>
+        <w:rPr>
+          <w:lang w:val="id_ID" w:bidi="id_ID"/>
+        </w:rPr>
+      </w:r>
+    </w:p>
+    <w:p>
+      <w:pPr/>
+      <w:r>
+        <w:rPr>
+          <w:lang w:val="id_ID" w:bidi="id_ID"/>
+        </w:rPr>
+      </w:r>
+    </w:p>
+    <w:p>
+      <w:pPr>
+        <w:pStyle w:val="Heading2"/>
+      </w:pPr>
+      <w:r>
+        <w:rPr>
+          <w:lang w:val="id_ID" w:bidi="id_ID"/>
+        </w:rPr>
+        <w:t>1 Raja-raja 5:13–18</w:t>
+      </w:r>
+      <w:r>
+        <w:rPr>
+          <w:lang w:val="id_ID" w:bidi="id_ID"/>
+        </w:rPr>
+      </w:r>
+    </w:p>
+    <w:p>
+      <w:pPr/>
+      <w:r>
+        <w:rPr>
+          <w:lang w:val="id_ID" w:bidi="id_ID"/>
+        </w:rPr>
+      </w:r>
+      <w:r>
+        <w:rPr>
+          <w:lang w:val="id_ID" w:bidi="id_ID"/>
+        </w:rPr>
+        <w:t xml:space="preserve">Bagian ini menjelaskan tentang tenaga kerja Salomo dan pembagian tugasnya. Kerja paksa adalah praktik umum di Timur Dekat kuno (lihat </w:t>
+      </w:r>
+      <w:r>
+        <w:rPr>
+          <w:lang w:val="id_ID" w:bidi="id_ID"/>
+        </w:rPr>
+        <w:t>catatan studi pada 1Raj. 4:6</w:t>
+      </w:r>
+      <w:r>
+        <w:rPr>
+          <w:lang w:val="id_ID" w:bidi="id_ID"/>
+        </w:rPr>
+        <w:t>).</w:t>
+      </w:r>
+      <w:r>
+        <w:rPr>
+          <w:lang w:val="id_ID" w:bidi="id_ID"/>
+        </w:rPr>
+      </w:r>
+      <w:r>
+        <w:rPr>
+          <w:lang w:val="id_ID" w:bidi="id_ID"/>
+        </w:rPr>
+      </w:r>
+    </w:p>
+    <w:p>
+      <w:pPr/>
+      <w:r>
+        <w:rPr>
+          <w:lang w:val="id_ID" w:bidi="id_ID"/>
+        </w:rPr>
+      </w:r>
+    </w:p>
+    <w:p>
+      <w:pPr>
+        <w:pStyle w:val="Heading2"/>
+      </w:pPr>
+      <w:r>
+        <w:rPr>
+          <w:lang w:val="id_ID" w:bidi="id_ID"/>
+        </w:rPr>
+        <w:t>1 Raja-raja 5:16</w:t>
+      </w:r>
+      <w:r>
+        <w:rPr>
+          <w:lang w:val="id_ID" w:bidi="id_ID"/>
+        </w:rPr>
+      </w:r>
+    </w:p>
+    <w:p>
+      <w:pPr/>
+      <w:r>
+        <w:rPr>
+          <w:lang w:val="id_ID" w:bidi="id_ID"/>
+        </w:rPr>
+      </w:r>
+      <w:r>
+        <w:rPr>
+          <w:lang w:val="id_ID" w:bidi="id_ID"/>
+        </w:rPr>
+        <w:t>3.600 mandor: Dalam 2 Tawarikh (</w:t>
+      </w:r>
+      <w:hyperlink r:id="rId208">
+        <w:r>
+          <w:rPr>
+            <w:lang w:val="id_ID" w:bidi="id_ID"/>
+          </w:rPr>
+          <w:rPr>
+            <w:color w:val="0000EE"/>
+            <w:u w:val="single"/>
+          </w:rPr>
+          <w:t>2Taw. 2:2</w:t>
+        </w:r>
+      </w:hyperlink>
+      <w:r>
+        <w:rPr>
+          <w:lang w:val="id_ID" w:bidi="id_ID"/>
+        </w:rPr>
+        <w:t xml:space="preserve">, </w:t>
+      </w:r>
+      <w:hyperlink r:id="rId209">
+        <w:r>
+          <w:rPr>
+            <w:lang w:val="id_ID" w:bidi="id_ID"/>
+          </w:rPr>
+          <w:rPr>
+            <w:color w:val="0000EE"/>
+            <w:u w:val="single"/>
+          </w:rPr>
+          <w:t>17–18</w:t>
+        </w:r>
+      </w:hyperlink>
+      <w:r>
+        <w:rPr>
+          <w:lang w:val="id_ID" w:bidi="id_ID"/>
+        </w:rPr>
+        <w:t xml:space="preserve">; </w:t>
+      </w:r>
+      <w:hyperlink r:id="rId210">
+        <w:r>
+          <w:rPr>
+            <w:lang w:val="id_ID" w:bidi="id_ID"/>
+          </w:rPr>
+          <w:rPr>
+            <w:color w:val="0000EE"/>
+            <w:u w:val="single"/>
+          </w:rPr>
+          <w:t>8:10</w:t>
+        </w:r>
+      </w:hyperlink>
+      <w:r>
+        <w:rPr>
+          <w:lang w:val="id_ID" w:bidi="id_ID"/>
+        </w:rPr>
+        <w:t xml:space="preserve">), jumlah </w:t>
+      </w:r>
+      <w:r>
+        <w:rPr>
+          <w:i/>
+          <w:lang w:val="id_ID" w:bidi="id_ID"/>
+        </w:rPr>
+        <w:t>mandor</w:t>
+      </w:r>
+      <w:r>
+        <w:rPr>
+          <w:lang w:val="id_ID" w:bidi="id_ID"/>
+        </w:rPr>
+        <w:t xml:space="preserve"> adalah 3.600 orang non-Israel dan 250 pengawas utama dari Israel. Angka dalam teks Ibrani </w:t>
+      </w:r>
+      <w:hyperlink r:id="rId211">
+        <w:r>
+          <w:rPr>
+            <w:lang w:val="id_ID" w:bidi="id_ID"/>
+          </w:rPr>
+          <w:rPr>
+            <w:color w:val="0000EE"/>
+            <w:u w:val="single"/>
+          </w:rPr>
+          <w:t>1Raj. 5:16</w:t>
+        </w:r>
+      </w:hyperlink>
+      <w:r>
+        <w:rPr>
+          <w:lang w:val="id_ID" w:bidi="id_ID"/>
+        </w:rPr>
+        <w:t xml:space="preserve"> dan </w:t>
+      </w:r>
+      <w:hyperlink r:id="rId212">
+        <w:r>
+          <w:rPr>
+            <w:lang w:val="id_ID" w:bidi="id_ID"/>
+          </w:rPr>
+          <w:rPr>
+            <w:color w:val="0000EE"/>
+            <w:u w:val="single"/>
+          </w:rPr>
+          <w:t>9:23</w:t>
+        </w:r>
+      </w:hyperlink>
+      <w:r>
+        <w:rPr>
+          <w:lang w:val="id_ID" w:bidi="id_ID"/>
+        </w:rPr>
+        <w:t xml:space="preserve"> adalah 3.300 </w:t>
+      </w:r>
+      <w:r>
+        <w:rPr>
+          <w:i/>
+          <w:lang w:val="id_ID" w:bidi="id_ID"/>
+        </w:rPr>
+        <w:t>mandor</w:t>
+      </w:r>
+      <w:r>
+        <w:rPr>
+          <w:lang w:val="id_ID" w:bidi="id_ID"/>
+        </w:rPr>
+        <w:t xml:space="preserve"> dan 550 pengawas utama. Mungkin 250 dari pengawas utama adalah orang Israel, dengan 300 orang non-Israel memegang pangkat yang sama.</w:t>
+      </w:r>
+      <w:r>
+        <w:rPr>
+          <w:lang w:val="id_ID" w:bidi="id_ID"/>
+        </w:rPr>
+      </w:r>
+      <w:r>
+        <w:rPr>
+          <w:lang w:val="id_ID" w:bidi="id_ID"/>
+        </w:rPr>
+      </w:r>
+    </w:p>
+    <w:p>
+      <w:pPr/>
+      <w:r>
+        <w:rPr>
+          <w:lang w:val="id_ID" w:bidi="id_ID"/>
+        </w:rPr>
+      </w:r>
+    </w:p>
+    <w:p>
+      <w:pPr>
+        <w:pStyle w:val="Heading2"/>
+      </w:pPr>
+      <w:r>
+        <w:rPr>
+          <w:lang w:val="id_ID" w:bidi="id_ID"/>
+        </w:rPr>
+        <w:t>1 Raja-raja 5:17–18</w:t>
+      </w:r>
+      <w:r>
+        <w:rPr>
+          <w:lang w:val="id_ID" w:bidi="id_ID"/>
+        </w:rPr>
+      </w:r>
+    </w:p>
+    <w:p>
+      <w:pPr/>
+      <w:r>
+        <w:rPr>
+          <w:lang w:val="id_ID" w:bidi="id_ID"/>
+        </w:rPr>
+      </w:r>
+      <w:r>
+        <w:rPr>
+          <w:lang w:val="id_ID" w:bidi="id_ID"/>
+        </w:rPr>
+        <w:t xml:space="preserve">Bongkahan-bongkahan batu besar berkualitas tinggi kemungkinan dipotong sesuai ukuran (lihat </w:t>
+      </w:r>
+      <w:hyperlink r:id="rId213">
+        <w:r>
+          <w:rPr>
+            <w:lang w:val="id_ID" w:bidi="id_ID"/>
+          </w:rPr>
+          <w:rPr>
+            <w:color w:val="0000EE"/>
+            <w:u w:val="single"/>
+          </w:rPr>
+          <w:t>1Raj. 7:10</w:t>
+        </w:r>
+      </w:hyperlink>
+      <w:r>
+        <w:rPr>
+          <w:lang w:val="id_ID" w:bidi="id_ID"/>
+        </w:rPr>
+        <w:t>) di tambang dekat Yerusalem (</w:t>
+      </w:r>
+      <w:hyperlink r:id="rId214">
+        <w:r>
+          <w:rPr>
+            <w:lang w:val="id_ID" w:bidi="id_ID"/>
+          </w:rPr>
+          <w:rPr>
+            <w:color w:val="0000EE"/>
+            <w:u w:val="single"/>
+          </w:rPr>
+          <w:t>1Raj. 6:7</w:t>
+        </w:r>
+      </w:hyperlink>
+      <w:r>
+        <w:rPr>
+          <w:lang w:val="id_ID" w:bidi="id_ID"/>
+        </w:rPr>
+        <w:t>). Kebutuhan untuk menangani batu-batu besar ini mungkin yang mendorong Salomo untuk memberlakukan kerja paksa. Para pengrajinnya termasuk orang-orang dari Gebal (Byblos), sebuah pelabuhan yang dikenal karena mengekspor kayu, menurut prasasti-prasasti Mesir kuno.</w:t>
+      </w:r>
+      <w:r>
+        <w:rPr>
+          <w:lang w:val="id_ID" w:bidi="id_ID"/>
+        </w:rPr>
+      </w:r>
+      <w:r>
+        <w:rPr>
+          <w:lang w:val="id_ID" w:bidi="id_ID"/>
+        </w:rPr>
+      </w:r>
+    </w:p>
+    <w:p>
+      <w:pPr/>
+      <w:r>
+        <w:rPr>
+          <w:lang w:val="id_ID" w:bidi="id_ID"/>
+        </w:rPr>
+      </w:r>
+    </w:p>
+    <w:p>
+      <w:pPr>
+        <w:pStyle w:val="Heading2"/>
+      </w:pPr>
+      <w:r>
+        <w:rPr>
+          <w:lang w:val="id_ID" w:bidi="id_ID"/>
+        </w:rPr>
+        <w:t>1 Raja-raja 6:1</w:t>
+      </w:r>
+      <w:r>
+        <w:rPr>
+          <w:lang w:val="id_ID" w:bidi="id_ID"/>
+        </w:rPr>
+      </w:r>
+    </w:p>
+    <w:p>
+      <w:pPr/>
+      <w:r>
+        <w:rPr>
+          <w:lang w:val="id_ID" w:bidi="id_ID"/>
+        </w:rPr>
+      </w:r>
+      <w:r>
+        <w:rPr>
+          <w:lang w:val="id_ID" w:bidi="id_ID"/>
+        </w:rPr>
+        <w:t xml:space="preserve">Tahun keempat pemerintahan Salomo adalah sekitar 967 SM. Jika angka 480 dianggap mewakili tahun kalender, maka tanggal keluarnya Israel dari Mesir diperkirakan sekitar tahun 1446 SM. Namun, mereka yang melihat angka tersebut secara simbolis (12 generasi kali 40 tahun masing-masing) menyarankan bahwa peristiwa Keluaran terjadi pada tanggal yang lebih kemudian, sekitar 1270 SM (lihat </w:t>
+      </w:r>
+      <w:r>
+        <w:rPr>
+          <w:lang w:val="id_ID" w:bidi="id_ID"/>
+        </w:rPr>
+        <w:t>Pendahuluan Kitab Keluaran</w:t>
+      </w:r>
+      <w:r>
+        <w:rPr>
+          <w:lang w:val="id_ID" w:bidi="id_ID"/>
+        </w:rPr>
+        <w:t>, “Tanggal Keluaran”).</w:t>
+      </w:r>
+      <w:r>
+        <w:rPr>
+          <w:lang w:val="id_ID" w:bidi="id_ID"/>
+        </w:rPr>
+      </w:r>
+      <w:r>
+        <w:rPr>
+          <w:lang w:val="id_ID" w:bidi="id_ID"/>
+        </w:rPr>
+      </w:r>
+    </w:p>
+    <w:p>
+      <w:pPr/>
+      <w:r>
+        <w:rPr>
+          <w:lang w:val="id_ID" w:bidi="id_ID"/>
+        </w:rPr>
+      </w:r>
+    </w:p>
+    <w:p>
+      <w:pPr>
+        <w:pStyle w:val="Heading2"/>
+      </w:pPr>
+      <w:r>
+        <w:rPr>
+          <w:lang w:val="id_ID" w:bidi="id_ID"/>
+        </w:rPr>
+        <w:t>1 Raja-raja 6:1–8.66</w:t>
+      </w:r>
+      <w:r>
+        <w:rPr>
+          <w:lang w:val="id_ID" w:bidi="id_ID"/>
+        </w:rPr>
+      </w:r>
+    </w:p>
+    <w:p>
+      <w:pPr/>
+      <w:r>
+        <w:rPr>
+          <w:lang w:val="id_ID" w:bidi="id_ID"/>
+        </w:rPr>
+      </w:r>
+      <w:r>
+        <w:rPr>
+          <w:lang w:val="id_ID" w:bidi="id_ID"/>
+        </w:rPr>
+        <w:t>Pembangunan Bait Suci dan kompleks istana serta perayaan pentahbisan Bait Suci menjadi pusat catatan dalam 1 Raja-raja tentang era Salomo. Bait Suci, yang didirikan untuk memuliakan Allah, merupakan bangunan terpenting bagi Israel, sehingga penulis 1 Raja-raja dengan cermat mencatat rincian pembangunannya.</w:t>
+      </w:r>
+      <w:r>
+        <w:rPr>
+          <w:lang w:val="id_ID" w:bidi="id_ID"/>
+        </w:rPr>
+      </w:r>
+      <w:r>
+        <w:rPr>
+          <w:lang w:val="id_ID" w:bidi="id_ID"/>
+        </w:rPr>
+      </w:r>
+    </w:p>
+    <w:p>
+      <w:pPr/>
+      <w:r>
+        <w:rPr>
+          <w:lang w:val="id_ID" w:bidi="id_ID"/>
+        </w:rPr>
+      </w:r>
+    </w:p>
+    <w:p>
+      <w:pPr>
+        <w:pStyle w:val="Heading2"/>
+      </w:pPr>
+      <w:r>
+        <w:rPr>
+          <w:lang w:val="id_ID" w:bidi="id_ID"/>
+        </w:rPr>
+        <w:t>1 Raja-raja 6:2</w:t>
+      </w:r>
+      <w:r>
+        <w:rPr>
+          <w:lang w:val="id_ID" w:bidi="id_ID"/>
+        </w:rPr>
+      </w:r>
+    </w:p>
+    <w:p>
+      <w:pPr/>
+      <w:r>
+        <w:rPr>
+          <w:lang w:val="id_ID" w:bidi="id_ID"/>
+        </w:rPr>
+      </w:r>
+      <w:r>
+        <w:rPr>
+          <w:lang w:val="id_ID" w:bidi="id_ID"/>
+        </w:rPr>
+        <w:t xml:space="preserve">Seperti Kemah Suci sebelumnya, Bait Suci (secara harfiah </w:t>
+      </w:r>
+      <w:r>
+        <w:rPr>
+          <w:i/>
+          <w:lang w:val="id_ID" w:bidi="id_ID"/>
+        </w:rPr>
+        <w:t>rumah</w:t>
+      </w:r>
+      <w:r>
+        <w:rPr>
+          <w:lang w:val="id_ID" w:bidi="id_ID"/>
+        </w:rPr>
+        <w:t>) adalah tempat di mana Allah bertemu dengan umat-Nya. Daud telah menyimpan bahan-bahan untuk digunakan dalam pembangunannya (</w:t>
+      </w:r>
+      <w:hyperlink r:id="rId215">
+        <w:r>
+          <w:rPr>
+            <w:lang w:val="id_ID" w:bidi="id_ID"/>
+          </w:rPr>
+          <w:rPr>
+            <w:color w:val="0000EE"/>
+            <w:u w:val="single"/>
+          </w:rPr>
+          <w:t>1Taw. 22:2–4</w:t>
+        </w:r>
+      </w:hyperlink>
+      <w:r>
+        <w:rPr>
+          <w:lang w:val="id_ID" w:bidi="id_ID"/>
+        </w:rPr>
+        <w:t xml:space="preserve">, </w:t>
+      </w:r>
+      <w:hyperlink r:id="rId216">
+        <w:r>
+          <w:rPr>
+            <w:lang w:val="id_ID" w:bidi="id_ID"/>
+          </w:rPr>
+          <w:rPr>
+            <w:color w:val="0000EE"/>
+            <w:u w:val="single"/>
+          </w:rPr>
+          <w:t>14</w:t>
+        </w:r>
+      </w:hyperlink>
+      <w:r>
+        <w:rPr>
+          <w:lang w:val="id_ID" w:bidi="id_ID"/>
+        </w:rPr>
+        <w:t>) dan telah membuat rencana untuk Bait Suci serta memberikannya kepada Salomo (</w:t>
+      </w:r>
+      <w:hyperlink r:id="rId217">
+        <w:r>
+          <w:rPr>
+            <w:lang w:val="id_ID" w:bidi="id_ID"/>
+          </w:rPr>
+          <w:rPr>
+            <w:color w:val="0000EE"/>
+            <w:u w:val="single"/>
+          </w:rPr>
+          <w:t>1Taw. 28:11–12</w:t>
+        </w:r>
+      </w:hyperlink>
+      <w:r>
+        <w:rPr>
+          <w:lang w:val="id_ID" w:bidi="id_ID"/>
+        </w:rPr>
+        <w:t xml:space="preserve">). Denah lantai Bait Suci mirip dengan Kemah Suci tetapi memiliki panjang dan lebar yang dua kali lipat serta ada peningkatan tinggi bangunan (bdk. </w:t>
+      </w:r>
+      <w:hyperlink r:id="rId218">
+        <w:r>
+          <w:rPr>
+            <w:lang w:val="id_ID" w:bidi="id_ID"/>
+          </w:rPr>
+          <w:rPr>
+            <w:color w:val="0000EE"/>
+            <w:u w:val="single"/>
+          </w:rPr>
+          <w:t>Kel. 26:3</w:t>
+        </w:r>
+      </w:hyperlink>
+      <w:r>
+        <w:rPr>
+          <w:lang w:val="id_ID" w:bidi="id_ID"/>
+        </w:rPr>
+        <w:t xml:space="preserve">, </w:t>
+      </w:r>
+      <w:hyperlink r:id="rId219">
+        <w:r>
+          <w:rPr>
+            <w:lang w:val="id_ID" w:bidi="id_ID"/>
+          </w:rPr>
+          <w:rPr>
+            <w:color w:val="0000EE"/>
+            <w:u w:val="single"/>
+          </w:rPr>
+          <w:t>15–30</w:t>
+        </w:r>
+      </w:hyperlink>
+      <w:r>
+        <w:rPr>
+          <w:lang w:val="id_ID" w:bidi="id_ID"/>
+        </w:rPr>
+        <w:t xml:space="preserve">; </w:t>
+      </w:r>
+      <w:hyperlink r:id="rId220">
+        <w:r>
+          <w:rPr>
+            <w:lang w:val="id_ID" w:bidi="id_ID"/>
+          </w:rPr>
+          <w:rPr>
+            <w:color w:val="0000EE"/>
+            <w:u w:val="single"/>
+          </w:rPr>
+          <w:t>36:26–34</w:t>
+        </w:r>
+      </w:hyperlink>
+      <w:r>
+        <w:rPr>
+          <w:lang w:val="id_ID" w:bidi="id_ID"/>
+        </w:rPr>
+        <w:t>).</w:t>
+      </w:r>
+      <w:r>
+        <w:rPr>
+          <w:lang w:val="id_ID" w:bidi="id_ID"/>
+        </w:rPr>
+      </w:r>
+      <w:r>
+        <w:rPr>
+          <w:lang w:val="id_ID" w:bidi="id_ID"/>
+        </w:rPr>
+      </w:r>
+    </w:p>
+    <w:p>
+      <w:pPr/>
+      <w:r>
+        <w:rPr>
+          <w:lang w:val="id_ID" w:bidi="id_ID"/>
+        </w:rPr>
+      </w:r>
+    </w:p>
+    <w:p>
+      <w:pPr>
+        <w:pStyle w:val="Heading2"/>
+      </w:pPr>
+      <w:r>
+        <w:rPr>
+          <w:lang w:val="id_ID" w:bidi="id_ID"/>
+        </w:rPr>
+        <w:t>1 Raja-raja 6:3–4</w:t>
+      </w:r>
+      <w:r>
+        <w:rPr>
+          <w:lang w:val="id_ID" w:bidi="id_ID"/>
+        </w:rPr>
+      </w:r>
+    </w:p>
+    <w:p>
+      <w:pPr/>
+      <w:r>
+        <w:rPr>
+          <w:lang w:val="id_ID" w:bidi="id_ID"/>
+        </w:rPr>
+      </w:r>
+      <w:r>
+        <w:rPr>
+          <w:lang w:val="id_ID" w:bidi="id_ID"/>
+        </w:rPr>
+        <w:t>Tidak seperti Kemah Suci, Bait Suci memiliki ruang masuk di bagian timur (atau serambi) dan dua pilar berdiri bebas di depan pintu masuk (</w:t>
+      </w:r>
+      <w:hyperlink r:id="rId221">
+        <w:r>
+          <w:rPr>
+            <w:lang w:val="id_ID" w:bidi="id_ID"/>
+          </w:rPr>
+          <w:rPr>
+            <w:color w:val="0000EE"/>
+            <w:u w:val="single"/>
+          </w:rPr>
+          <w:t>1Raj. 7:15–22</w:t>
+        </w:r>
+      </w:hyperlink>
+      <w:r>
+        <w:rPr>
+          <w:lang w:val="id_ID" w:bidi="id_ID"/>
+        </w:rPr>
+        <w:t>).</w:t>
+      </w:r>
+      <w:r>
+        <w:rPr>
+          <w:lang w:val="id_ID" w:bidi="id_ID"/>
+        </w:rPr>
+      </w:r>
+      <w:r>
+        <w:rPr>
+          <w:lang w:val="id_ID" w:bidi="id_ID"/>
+        </w:rPr>
+      </w:r>
+    </w:p>
+    <w:p>
+      <w:pPr/>
+      <w:r>
+        <w:rPr>
+          <w:lang w:val="id_ID" w:bidi="id_ID"/>
+        </w:rPr>
+      </w:r>
+    </w:p>
+    <w:p>
+      <w:pPr>
+        <w:pStyle w:val="Heading2"/>
+      </w:pPr>
+      <w:r>
+        <w:rPr>
+          <w:lang w:val="id_ID" w:bidi="id_ID"/>
+        </w:rPr>
+        <w:t>1 Raja-raja 6:11–13</w:t>
+      </w:r>
+      <w:r>
+        <w:rPr>
+          <w:lang w:val="id_ID" w:bidi="id_ID"/>
+        </w:rPr>
+      </w:r>
+    </w:p>
+    <w:p>
+      <w:pPr/>
+      <w:r>
+        <w:rPr>
+          <w:lang w:val="id_ID" w:bidi="id_ID"/>
+        </w:rPr>
+      </w:r>
+      <w:r>
+        <w:rPr>
+          <w:lang w:val="id_ID" w:bidi="id_ID"/>
+        </w:rPr>
+        <w:t>Tuhan memiliki pesan yang menghibur untuk Salomo. Karena Allah telah muncul kepada Salomo sebelum (</w:t>
+      </w:r>
+      <w:hyperlink r:id="rId222">
+        <w:r>
+          <w:rPr>
+            <w:lang w:val="id_ID" w:bidi="id_ID"/>
+          </w:rPr>
+          <w:rPr>
+            <w:color w:val="0000EE"/>
+            <w:u w:val="single"/>
+          </w:rPr>
+          <w:t>1Raj. 3:5</w:t>
+        </w:r>
+      </w:hyperlink>
+      <w:r>
+        <w:rPr>
+          <w:lang w:val="id_ID" w:bidi="id_ID"/>
+        </w:rPr>
+        <w:t>) dan setelah (</w:t>
+      </w:r>
+      <w:hyperlink r:id="rId223">
+        <w:r>
+          <w:rPr>
+            <w:lang w:val="id_ID" w:bidi="id_ID"/>
+          </w:rPr>
+          <w:rPr>
+            <w:color w:val="0000EE"/>
+            <w:u w:val="single"/>
+          </w:rPr>
+          <w:t>1Raj. 9:2</w:t>
+        </w:r>
+      </w:hyperlink>
+      <w:r>
+        <w:rPr>
+          <w:lang w:val="id_ID" w:bidi="id_ID"/>
+        </w:rPr>
+        <w:t xml:space="preserve">) peristiwa ini, </w:t>
+      </w:r>
+      <w:r>
+        <w:rPr>
+          <w:i/>
+          <w:lang w:val="id_ID" w:bidi="id_ID"/>
+        </w:rPr>
+        <w:t>pesan</w:t>
+      </w:r>
+      <w:r>
+        <w:rPr>
+          <w:lang w:val="id_ID" w:bidi="id_ID"/>
+        </w:rPr>
+        <w:t xml:space="preserve"> ini mungkin datang kepadanya melalui seorang nabi. Kata-kata tersebut mengingatkan raja akan janji Allah sebelumnya (</w:t>
+      </w:r>
+      <w:hyperlink r:id="rId224">
+        <w:r>
+          <w:rPr>
+            <w:lang w:val="id_ID" w:bidi="id_ID"/>
+          </w:rPr>
+          <w:rPr>
+            <w:color w:val="0000EE"/>
+            <w:u w:val="single"/>
+          </w:rPr>
+          <w:t>1Raj. 3:14</w:t>
+        </w:r>
+      </w:hyperlink>
+      <w:r>
+        <w:rPr>
+          <w:lang w:val="id_ID" w:bidi="id_ID"/>
+        </w:rPr>
+        <w:t>): Jika Salomo tetap setia kepada Allah, Bait Suci yang sedang dibangunnya akan menjadi tempat tinggal abadi bagi Allah.</w:t>
+      </w:r>
+      <w:r>
+        <w:rPr>
+          <w:lang w:val="id_ID" w:bidi="id_ID"/>
+        </w:rPr>
+      </w:r>
+      <w:r>
+        <w:rPr>
+          <w:lang w:val="id_ID" w:bidi="id_ID"/>
+        </w:rPr>
+      </w:r>
+    </w:p>
+    <w:p>
+      <w:pPr/>
+      <w:r>
+        <w:rPr>
+          <w:lang w:val="id_ID" w:bidi="id_ID"/>
+        </w:rPr>
+      </w:r>
+    </w:p>
+    <w:p>
+      <w:pPr>
+        <w:pStyle w:val="Heading2"/>
+      </w:pPr>
+      <w:r>
+        <w:rPr>
+          <w:lang w:val="id_ID" w:bidi="id_ID"/>
+        </w:rPr>
+        <w:t>1 Raja-raja 6:14–35</w:t>
+      </w:r>
+      <w:r>
+        <w:rPr>
+          <w:lang w:val="id_ID" w:bidi="id_ID"/>
+        </w:rPr>
+      </w:r>
+    </w:p>
+    <w:p>
+      <w:pPr/>
+      <w:r>
+        <w:rPr>
+          <w:lang w:val="id_ID" w:bidi="id_ID"/>
+        </w:rPr>
+      </w:r>
+      <w:r>
+        <w:rPr>
+          <w:lang w:val="id_ID" w:bidi="id_ID"/>
+        </w:rPr>
+        <w:t>Fokus beralih ke bagian dalam Bait Suci. Meskipun lokasi Bait Suci tidak disebutkan di sini, penulis Tawarikh menempatkannya di bekas tempat pengirikan Arauna (</w:t>
+      </w:r>
+      <w:hyperlink r:id="rId225">
+        <w:r>
+          <w:rPr>
+            <w:lang w:val="id_ID" w:bidi="id_ID"/>
+          </w:rPr>
+          <w:rPr>
+            <w:color w:val="0000EE"/>
+            <w:u w:val="single"/>
+          </w:rPr>
+          <w:t>1Taw. 21:18–25</w:t>
+        </w:r>
+      </w:hyperlink>
+      <w:r>
+        <w:rPr>
+          <w:lang w:val="id_ID" w:bidi="id_ID"/>
+        </w:rPr>
+        <w:t xml:space="preserve">; </w:t>
+      </w:r>
+      <w:hyperlink r:id="rId226">
+        <w:r>
+          <w:rPr>
+            <w:lang w:val="id_ID" w:bidi="id_ID"/>
+          </w:rPr>
+          <w:rPr>
+            <w:color w:val="0000EE"/>
+            <w:u w:val="single"/>
+          </w:rPr>
+          <w:t>2Taw. 3:1</w:t>
+        </w:r>
+      </w:hyperlink>
+      <w:r>
+        <w:rPr>
+          <w:lang w:val="id_ID" w:bidi="id_ID"/>
+        </w:rPr>
+        <w:t>). Tempat ini secara tradisional dianggap sebagai lokasi Gunung Moria (</w:t>
+      </w:r>
+      <w:hyperlink r:id="rId227">
+        <w:r>
+          <w:rPr>
+            <w:lang w:val="id_ID" w:bidi="id_ID"/>
+          </w:rPr>
+          <w:rPr>
+            <w:color w:val="0000EE"/>
+            <w:u w:val="single"/>
+          </w:rPr>
+          <w:t>Kej. 22:2</w:t>
+        </w:r>
+      </w:hyperlink>
+      <w:r>
+        <w:rPr>
+          <w:lang w:val="id_ID" w:bidi="id_ID"/>
+        </w:rPr>
+        <w:t>). Bait Salomo terletak di sudut timur laut Yerusalem (sekarang disebut "kota tua") di area yang kini diasosiasikan dengan Kubah Batu.</w:t>
+      </w:r>
+      <w:r>
+        <w:rPr>
+          <w:lang w:val="id_ID" w:bidi="id_ID"/>
+        </w:rPr>
+      </w:r>
+      <w:r>
+        <w:rPr>
+          <w:lang w:val="id_ID" w:bidi="id_ID"/>
+        </w:rPr>
+      </w:r>
+    </w:p>
+    <w:p>
+      <w:pPr/>
+      <w:r>
+        <w:rPr>
+          <w:lang w:val="id_ID" w:bidi="id_ID"/>
+        </w:rPr>
+      </w:r>
+    </w:p>
+    <w:p>
+      <w:pPr>
+        <w:pStyle w:val="Heading2"/>
+      </w:pPr>
+      <w:r>
+        <w:rPr>
+          <w:lang w:val="id_ID" w:bidi="id_ID"/>
+        </w:rPr>
+        <w:t>1 Raja-raja 6:15–18</w:t>
+      </w:r>
+      <w:r>
+        <w:rPr>
+          <w:lang w:val="id_ID" w:bidi="id_ID"/>
+        </w:rPr>
+      </w:r>
+    </w:p>
+    <w:p>
+      <w:pPr/>
+      <w:r>
+        <w:rPr>
+          <w:lang w:val="id_ID" w:bidi="id_ID"/>
+        </w:rPr>
+      </w:r>
+      <w:r>
+        <w:rPr>
+          <w:lang w:val="id_ID" w:bidi="id_ID"/>
+        </w:rPr>
+        <w:t>melapisi dinding … dengan papan kayu: Dinding interior dilapisi dengan panel kayu aras dari lantai hingga langit-langit, sehingga tidak ada batu dari sisi luar yang terlihat. Efeknya sangat indah, mencerminkan perawatan yang teliti dan biaya yang besar.</w:t>
+      </w:r>
+      <w:r>
+        <w:rPr>
+          <w:lang w:val="id_ID" w:bidi="id_ID"/>
+        </w:rPr>
+      </w:r>
+      <w:r>
+        <w:rPr>
+          <w:lang w:val="id_ID" w:bidi="id_ID"/>
+        </w:rPr>
+      </w:r>
+    </w:p>
+    <w:p>
+      <w:pPr/>
+      <w:r>
+        <w:rPr>
+          <w:lang w:val="id_ID" w:bidi="id_ID"/>
+        </w:rPr>
+      </w:r>
+    </w:p>
+    <w:p>
+      <w:pPr>
+        <w:pStyle w:val="Heading2"/>
+      </w:pPr>
+      <w:r>
+        <w:rPr>
+          <w:lang w:val="id_ID" w:bidi="id_ID"/>
+        </w:rPr>
+        <w:t>1 Raja-raja 6:19–22</w:t>
+      </w:r>
+      <w:r>
+        <w:rPr>
+          <w:lang w:val="id_ID" w:bidi="id_ID"/>
+        </w:rPr>
+      </w:r>
+    </w:p>
+    <w:p>
+      <w:pPr/>
+      <w:r>
+        <w:rPr>
+          <w:lang w:val="id_ID" w:bidi="id_ID"/>
+        </w:rPr>
+      </w:r>
+      <w:r>
+        <w:rPr>
+          <w:lang w:val="id_ID" w:bidi="id_ID"/>
+        </w:rPr>
+        <w:t>Menurut pola Kemah Suci, ruang dalam yang dilapisi dengan emas murni di bagian dalam, dipisahkan dari ruang utama Bait Suci oleh tirai (</w:t>
+      </w:r>
+      <w:hyperlink r:id="rId228">
+        <w:r>
+          <w:rPr>
+            <w:lang w:val="id_ID" w:bidi="id_ID"/>
+          </w:rPr>
+          <w:rPr>
+            <w:color w:val="0000EE"/>
+            <w:u w:val="single"/>
+          </w:rPr>
+          <w:t>2Taw. 3:14</w:t>
+        </w:r>
+      </w:hyperlink>
+      <w:r>
+        <w:rPr>
+          <w:lang w:val="id_ID" w:bidi="id_ID"/>
+        </w:rPr>
+        <w:t xml:space="preserve">) dan rantai emas. Seperti Ruang Mahakudus di Kemah Suci, </w:t>
+      </w:r>
+      <w:r>
+        <w:rPr>
+          <w:i/>
+          <w:lang w:val="id_ID" w:bidi="id_ID"/>
+        </w:rPr>
+        <w:t>ruang dalam</w:t>
+      </w:r>
+      <w:r>
+        <w:rPr>
+          <w:lang w:val="id_ID" w:bidi="id_ID"/>
+        </w:rPr>
+        <w:t xml:space="preserve"> berbentuk kubus sempurna. Di dalamnya terdapat Tabut Perjanjian Tuhan yang melambangkan kehadiran Allah. Tempat pendamaian berada di atas </w:t>
+      </w:r>
+      <w:r>
+        <w:rPr>
+          <w:i/>
+          <w:lang w:val="id_ID" w:bidi="id_ID"/>
+        </w:rPr>
+        <w:t>Tabut</w:t>
+      </w:r>
+      <w:r>
+        <w:rPr>
+          <w:lang w:val="id_ID" w:bidi="id_ID"/>
+        </w:rPr>
+        <w:t xml:space="preserve"> (</w:t>
+      </w:r>
+      <w:hyperlink r:id="rId229">
+        <w:r>
+          <w:rPr>
+            <w:lang w:val="id_ID" w:bidi="id_ID"/>
+          </w:rPr>
+          <w:rPr>
+            <w:color w:val="0000EE"/>
+            <w:u w:val="single"/>
+          </w:rPr>
+          <w:t>Kel. 25:17</w:t>
+        </w:r>
+      </w:hyperlink>
+      <w:r>
+        <w:rPr>
+          <w:lang w:val="id_ID" w:bidi="id_ID"/>
+        </w:rPr>
+        <w:t>); imam besar setiap tahun membuat pendamaian bagi Bangsa Israel dengan memercikkan darah korban pendamaian di atasnya (</w:t>
+      </w:r>
+      <w:hyperlink r:id="rId230">
+        <w:r>
+          <w:rPr>
+            <w:lang w:val="id_ID" w:bidi="id_ID"/>
+          </w:rPr>
+          <w:rPr>
+            <w:color w:val="0000EE"/>
+            <w:u w:val="single"/>
+          </w:rPr>
+          <w:t>Im. 16:1–19</w:t>
+        </w:r>
+      </w:hyperlink>
+      <w:r>
+        <w:rPr>
+          <w:lang w:val="id_ID" w:bidi="id_ID"/>
+        </w:rPr>
+        <w:t>). • Mezbah yang termasuk dalam Ruang Mahakudus berdiri di ruang utama. Para imam membakar ukupan di sana setiap hari (</w:t>
+      </w:r>
+      <w:hyperlink r:id="rId231">
+        <w:r>
+          <w:rPr>
+            <w:lang w:val="id_ID" w:bidi="id_ID"/>
+          </w:rPr>
+          <w:rPr>
+            <w:color w:val="0000EE"/>
+            <w:u w:val="single"/>
+          </w:rPr>
+          <w:t>Kel. 30:34–38</w:t>
+        </w:r>
+      </w:hyperlink>
+      <w:r>
+        <w:rPr>
+          <w:lang w:val="id_ID" w:bidi="id_ID"/>
+        </w:rPr>
+        <w:t xml:space="preserve">; </w:t>
+      </w:r>
+      <w:hyperlink r:id="rId232">
+        <w:r>
+          <w:rPr>
+            <w:lang w:val="id_ID" w:bidi="id_ID"/>
+          </w:rPr>
+          <w:rPr>
+            <w:color w:val="0000EE"/>
+            <w:u w:val="single"/>
+          </w:rPr>
+          <w:t>37:25–29</w:t>
+        </w:r>
+      </w:hyperlink>
+      <w:r>
+        <w:rPr>
+          <w:lang w:val="id_ID" w:bidi="id_ID"/>
+        </w:rPr>
+        <w:t xml:space="preserve">). Mezbah terbuat dari kayu aras dan dilapisi dengan </w:t>
+      </w:r>
+      <w:r>
+        <w:rPr>
+          <w:i/>
+          <w:lang w:val="id_ID" w:bidi="id_ID"/>
+        </w:rPr>
+        <w:t>emas.</w:t>
+      </w:r>
+      <w:r>
+        <w:rPr>
+          <w:lang w:val="id_ID" w:bidi="id_ID"/>
+        </w:rPr>
+        <w:t xml:space="preserve"> • Seperti </w:t>
+      </w:r>
+      <w:r>
+        <w:rPr>
+          <w:i/>
+          <w:lang w:val="id_ID" w:bidi="id_ID"/>
+        </w:rPr>
+        <w:t>ruang dalam,</w:t>
+      </w:r>
+      <w:r>
+        <w:rPr>
+          <w:lang w:val="id_ID" w:bidi="id_ID"/>
+        </w:rPr>
+        <w:t xml:space="preserve"> ruang utama juga sepenuhnya </w:t>
+      </w:r>
+      <w:r>
+        <w:rPr>
+          <w:i/>
+          <w:lang w:val="id_ID" w:bidi="id_ID"/>
+        </w:rPr>
+        <w:t>dilapisi dengan emas,</w:t>
+      </w:r>
+      <w:r>
+        <w:rPr>
+          <w:lang w:val="id_ID" w:bidi="id_ID"/>
+        </w:rPr>
+        <w:t xml:space="preserve"> yang mengingatkan para imam bahwa Allah Mahakuasa hadir di situ. Ruang utama juga menampung sepuluh kaki dian emas, sepuluh meja (</w:t>
+      </w:r>
+      <w:hyperlink r:id="rId233">
+        <w:r>
+          <w:rPr>
+            <w:lang w:val="id_ID" w:bidi="id_ID"/>
+          </w:rPr>
+          <w:rPr>
+            <w:color w:val="0000EE"/>
+            <w:u w:val="single"/>
+          </w:rPr>
+          <w:t>2Taw. 4:7–8</w:t>
+        </w:r>
+      </w:hyperlink>
+      <w:r>
+        <w:rPr>
+          <w:lang w:val="id_ID" w:bidi="id_ID"/>
+        </w:rPr>
+        <w:t>), dan perabotan lainnya (</w:t>
+      </w:r>
+      <w:hyperlink r:id="rId234">
+        <w:r>
+          <w:rPr>
+            <w:lang w:val="id_ID" w:bidi="id_ID"/>
+          </w:rPr>
+          <w:rPr>
+            <w:color w:val="0000EE"/>
+            <w:u w:val="single"/>
+          </w:rPr>
+          <w:t>1Raj. 7:48–50</w:t>
+        </w:r>
+      </w:hyperlink>
+      <w:r>
+        <w:rPr>
+          <w:lang w:val="id_ID" w:bidi="id_ID"/>
+        </w:rPr>
+        <w:t>).</w:t>
+      </w:r>
+      <w:r>
+        <w:rPr>
+          <w:lang w:val="id_ID" w:bidi="id_ID"/>
+        </w:rPr>
+      </w:r>
+      <w:r>
+        <w:rPr>
+          <w:lang w:val="id_ID" w:bidi="id_ID"/>
+        </w:rPr>
+      </w:r>
+    </w:p>
+    <w:p>
+      <w:pPr/>
+      <w:r>
+        <w:rPr>
+          <w:lang w:val="id_ID" w:bidi="id_ID"/>
+        </w:rPr>
+      </w:r>
+    </w:p>
+    <w:p>
+      <w:pPr>
+        <w:pStyle w:val="Heading2"/>
+      </w:pPr>
+      <w:r>
+        <w:rPr>
+          <w:lang w:val="id_ID" w:bidi="id_ID"/>
+        </w:rPr>
+        <w:t>1 Raja-raja 6:23–28</w:t>
+      </w:r>
+      <w:r>
+        <w:rPr>
+          <w:lang w:val="id_ID" w:bidi="id_ID"/>
+        </w:rPr>
+      </w:r>
+    </w:p>
+    <w:p>
+      <w:pPr/>
+      <w:r>
+        <w:rPr>
+          <w:lang w:val="id_ID" w:bidi="id_ID"/>
+        </w:rPr>
+      </w:r>
+      <w:r>
+        <w:rPr>
+          <w:lang w:val="id_ID" w:bidi="id_ID"/>
+        </w:rPr>
+        <w:t xml:space="preserve">Di dalam ruang suci terdapat dua kerub (lihat </w:t>
+      </w:r>
+      <w:r>
+        <w:rPr>
+          <w:lang w:val="id_ID" w:bidi="id_ID"/>
+        </w:rPr>
+        <w:t>catatan studi pada 1Taw. 28:18</w:t>
+      </w:r>
+      <w:r>
+        <w:rPr>
+          <w:lang w:val="id_ID" w:bidi="id_ID"/>
+        </w:rPr>
+        <w:t>) yang terbuat dari kayu zaitun dan dilapisi dengan emas. Mereka berdiri seperti penjaga menghadap pintu (</w:t>
+      </w:r>
+      <w:hyperlink r:id="rId235">
+        <w:r>
+          <w:rPr>
+            <w:lang w:val="id_ID" w:bidi="id_ID"/>
+          </w:rPr>
+          <w:rPr>
+            <w:color w:val="0000EE"/>
+            <w:u w:val="single"/>
+          </w:rPr>
+          <w:t>2Taw. 3:13</w:t>
+        </w:r>
+      </w:hyperlink>
+      <w:r>
+        <w:rPr>
+          <w:lang w:val="id_ID" w:bidi="id_ID"/>
+        </w:rPr>
+        <w:t xml:space="preserve">), dengan rentang sayap gabungan mencapai dari dinding ke dinding. Bersama dengan dua </w:t>
+      </w:r>
+      <w:r>
+        <w:rPr>
+          <w:i/>
+          <w:lang w:val="id_ID" w:bidi="id_ID"/>
+        </w:rPr>
+        <w:t>kerub</w:t>
+      </w:r>
+      <w:r>
+        <w:rPr>
+          <w:lang w:val="id_ID" w:bidi="id_ID"/>
+        </w:rPr>
+        <w:t xml:space="preserve"> yang lebih kecil yang saling berhadapan di atas Tabut (</w:t>
+      </w:r>
+      <w:hyperlink r:id="rId236">
+        <w:r>
+          <w:rPr>
+            <w:lang w:val="id_ID" w:bidi="id_ID"/>
+          </w:rPr>
+          <w:rPr>
+            <w:color w:val="0000EE"/>
+            <w:u w:val="single"/>
+          </w:rPr>
+          <w:t>Kel. 25:17–21</w:t>
+        </w:r>
+      </w:hyperlink>
+      <w:r>
+        <w:rPr>
+          <w:lang w:val="id_ID" w:bidi="id_ID"/>
+        </w:rPr>
+        <w:t>), mereka melambangkan kehadiran yang mengagumkan dari Allah Yang Maha Kudus.</w:t>
+      </w:r>
+      <w:r>
+        <w:rPr>
+          <w:lang w:val="id_ID" w:bidi="id_ID"/>
+        </w:rPr>
+      </w:r>
+      <w:r>
+        <w:rPr>
+          <w:lang w:val="id_ID" w:bidi="id_ID"/>
+        </w:rPr>
+      </w:r>
+    </w:p>
+    <w:p>
+      <w:pPr/>
+      <w:r>
+        <w:rPr>
+          <w:lang w:val="id_ID" w:bidi="id_ID"/>
+        </w:rPr>
+      </w:r>
+    </w:p>
+    <w:p>
+      <w:pPr>
+        <w:pStyle w:val="Heading2"/>
+      </w:pPr>
+      <w:r>
+        <w:rPr>
+          <w:lang w:val="id_ID" w:bidi="id_ID"/>
+        </w:rPr>
+        <w:t>1 Raja-raja 6:36–38</w:t>
+      </w:r>
+      <w:r>
+        <w:rPr>
+          <w:lang w:val="id_ID" w:bidi="id_ID"/>
+        </w:rPr>
+      </w:r>
+    </w:p>
+    <w:p>
+      <w:pPr/>
+      <w:r>
+        <w:rPr>
+          <w:lang w:val="id_ID" w:bidi="id_ID"/>
+        </w:rPr>
+      </w:r>
+      <w:r>
+        <w:rPr>
+          <w:lang w:val="id_ID" w:bidi="id_ID"/>
+        </w:rPr>
+        <w:t>Halaman dalam yang mengelilingi Bait Suci dibatasi untuk para imam (</w:t>
+      </w:r>
+      <w:hyperlink r:id="rId237">
+        <w:r>
+          <w:rPr>
+            <w:lang w:val="id_ID" w:bidi="id_ID"/>
+          </w:rPr>
+          <w:rPr>
+            <w:color w:val="0000EE"/>
+            <w:u w:val="single"/>
+          </w:rPr>
+          <w:t>2Taw. 4:9</w:t>
+        </w:r>
+      </w:hyperlink>
+      <w:r>
+        <w:rPr>
+          <w:lang w:val="id_ID" w:bidi="id_ID"/>
+        </w:rPr>
+        <w:t>) dan berisi mezbah tembaga (</w:t>
+      </w:r>
+      <w:hyperlink r:id="rId238">
+        <w:r>
+          <w:rPr>
+            <w:lang w:val="id_ID" w:bidi="id_ID"/>
+          </w:rPr>
+          <w:rPr>
+            <w:color w:val="0000EE"/>
+            <w:u w:val="single"/>
+          </w:rPr>
+          <w:t>2Taw. 4:1</w:t>
+        </w:r>
+      </w:hyperlink>
+      <w:r>
+        <w:rPr>
+          <w:lang w:val="id_ID" w:bidi="id_ID"/>
+        </w:rPr>
+        <w:t>), Lautan tembaga (</w:t>
+      </w:r>
+      <w:hyperlink r:id="rId239">
+        <w:r>
+          <w:rPr>
+            <w:lang w:val="id_ID" w:bidi="id_ID"/>
+          </w:rPr>
+          <w:rPr>
+            <w:color w:val="0000EE"/>
+            <w:u w:val="single"/>
+          </w:rPr>
+          <w:t>1Raj. 7:23–26</w:t>
+        </w:r>
+      </w:hyperlink>
+      <w:r>
+        <w:rPr>
+          <w:lang w:val="id_ID" w:bidi="id_ID"/>
+        </w:rPr>
+        <w:t xml:space="preserve">; </w:t>
+      </w:r>
+      <w:hyperlink r:id="rId240">
+        <w:r>
+          <w:rPr>
+            <w:lang w:val="id_ID" w:bidi="id_ID"/>
+          </w:rPr>
+          <w:rPr>
+            <w:color w:val="0000EE"/>
+            <w:u w:val="single"/>
+          </w:rPr>
+          <w:t>2Taw. 4:2–5</w:t>
+        </w:r>
+      </w:hyperlink>
+      <w:r>
+        <w:rPr>
+          <w:lang w:val="id_ID" w:bidi="id_ID"/>
+        </w:rPr>
+        <w:t>), serta sepuluh kereta yang dapat menampung sepuluh bejana air untuk pemurnian (</w:t>
+      </w:r>
+      <w:hyperlink r:id="rId241">
+        <w:r>
+          <w:rPr>
+            <w:lang w:val="id_ID" w:bidi="id_ID"/>
+          </w:rPr>
+          <w:rPr>
+            <w:color w:val="0000EE"/>
+            <w:u w:val="single"/>
+          </w:rPr>
+          <w:t>1Raj. 7:27–40</w:t>
+        </w:r>
+      </w:hyperlink>
+      <w:r>
+        <w:rPr>
+          <w:lang w:val="id_ID" w:bidi="id_ID"/>
+        </w:rPr>
+        <w:t xml:space="preserve">; </w:t>
+      </w:r>
+      <w:hyperlink r:id="rId242">
+        <w:r>
+          <w:rPr>
+            <w:lang w:val="id_ID" w:bidi="id_ID"/>
+          </w:rPr>
+          <w:rPr>
+            <w:color w:val="0000EE"/>
+            <w:u w:val="single"/>
+          </w:rPr>
+          <w:t>2Taw. 4:6</w:t>
+        </w:r>
+      </w:hyperlink>
+      <w:r>
+        <w:rPr>
+          <w:lang w:val="id_ID" w:bidi="id_ID"/>
+        </w:rPr>
+        <w:t>).</w:t>
+      </w:r>
+      <w:r>
+        <w:rPr>
+          <w:lang w:val="id_ID" w:bidi="id_ID"/>
+        </w:rPr>
+      </w:r>
+      <w:r>
+        <w:rPr>
+          <w:lang w:val="id_ID" w:bidi="id_ID"/>
+        </w:rPr>
+      </w:r>
+    </w:p>
+    <w:p>
+      <w:pPr/>
+      <w:r>
+        <w:rPr>
+          <w:lang w:val="id_ID" w:bidi="id_ID"/>
+        </w:rPr>
+      </w:r>
+    </w:p>
+    <w:p>
+      <w:pPr>
+        <w:pStyle w:val="Heading2"/>
+      </w:pPr>
+      <w:r>
+        <w:rPr>
+          <w:lang w:val="id_ID" w:bidi="id_ID"/>
+        </w:rPr>
+        <w:t>1 Raja-raja 6:38</w:t>
+      </w:r>
+      <w:r>
+        <w:rPr>
+          <w:lang w:val="id_ID" w:bidi="id_ID"/>
+        </w:rPr>
+      </w:r>
+    </w:p>
+    <w:p>
+      <w:pPr/>
+      <w:r>
+        <w:rPr>
+          <w:lang w:val="id_ID" w:bidi="id_ID"/>
+        </w:rPr>
+      </w:r>
+      <w:r>
+        <w:rPr>
+          <w:lang w:val="id_ID" w:bidi="id_ID"/>
+        </w:rPr>
+        <w:t xml:space="preserve">Pertengahan musim gugur (secar harfiah, </w:t>
+      </w:r>
+      <w:r>
+        <w:rPr>
+          <w:i/>
+          <w:lang w:val="id_ID" w:bidi="id_ID"/>
+        </w:rPr>
+        <w:t>bulan kedelapan</w:t>
+      </w:r>
+      <w:r>
+        <w:rPr>
+          <w:lang w:val="id_ID" w:bidi="id_ID"/>
+        </w:rPr>
+        <w:t>), di bulan Bul: Tahun itu adalah 960 SM.</w:t>
+      </w:r>
+      <w:r>
+        <w:rPr>
+          <w:lang w:val="id_ID" w:bidi="id_ID"/>
+        </w:rPr>
+      </w:r>
+      <w:r>
+        <w:rPr>
+          <w:lang w:val="id_ID" w:bidi="id_ID"/>
+        </w:rPr>
+      </w:r>
+    </w:p>
+    <w:p>
+      <w:pPr/>
+      <w:r>
+        <w:rPr>
+          <w:lang w:val="id_ID" w:bidi="id_ID"/>
+        </w:rPr>
+      </w:r>
+    </w:p>
+    <w:p>
+      <w:pPr>
+        <w:pStyle w:val="Heading2"/>
+      </w:pPr>
+      <w:r>
+        <w:rPr>
+          <w:lang w:val="id_ID" w:bidi="id_ID"/>
+        </w:rPr>
+        <w:t>1 Raja-raja 7:1–12</w:t>
+      </w:r>
+      <w:r>
+        <w:rPr>
+          <w:lang w:val="id_ID" w:bidi="id_ID"/>
+        </w:rPr>
+      </w:r>
+    </w:p>
+    <w:p>
+      <w:pPr/>
+      <w:r>
+        <w:rPr>
+          <w:lang w:val="id_ID" w:bidi="id_ID"/>
+        </w:rPr>
+      </w:r>
+      <w:r>
+        <w:rPr>
+          <w:lang w:val="id_ID" w:bidi="id_ID"/>
+        </w:rPr>
+        <w:t xml:space="preserve">Sebelum menggambarkan perabotan Bait Suci, penulis menyebutkan pembangunan kompleks istana Salomo. Beberapa bangunan dalam kompleks ini memakan waktu hampir dua kali lebih lama untuk dibangun (tiga belas tahun) dibandingkan dengan Bait Suci (tujuh tahun, </w:t>
+      </w:r>
+      <w:hyperlink r:id="rId243">
+        <w:r>
+          <w:rPr>
+            <w:lang w:val="id_ID" w:bidi="id_ID"/>
+          </w:rPr>
+          <w:rPr>
+            <w:color w:val="0000EE"/>
+            <w:u w:val="single"/>
+          </w:rPr>
+          <w:t>1Raj. 6:38</w:t>
+        </w:r>
+      </w:hyperlink>
+      <w:r>
+        <w:rPr>
+          <w:lang w:val="id_ID" w:bidi="id_ID"/>
+        </w:rPr>
+        <w:t>). Seluruh proyek pembangunan memakan waktu dua puluh tahun (</w:t>
+      </w:r>
+      <w:hyperlink r:id="rId244">
+        <w:r>
+          <w:rPr>
+            <w:lang w:val="id_ID" w:bidi="id_ID"/>
+          </w:rPr>
+          <w:rPr>
+            <w:color w:val="0000EE"/>
+            <w:u w:val="single"/>
+          </w:rPr>
+          <w:t>1Raj. 9:10</w:t>
+        </w:r>
+      </w:hyperlink>
+      <w:r>
+        <w:rPr>
+          <w:lang w:val="id_ID" w:bidi="id_ID"/>
+        </w:rPr>
+        <w:t>). Meskipun detail konstruksinya singkat, penemuan arkeologi dari dua bangunan Salomo memberikan gambaran tentang bagaimana rupa istana ini. Meskipun megah, istana Salomo bukanlah fokus penulis; minatnya adalah pada Bait Suci, tempat kediaman Allah.</w:t>
+      </w:r>
+      <w:r>
+        <w:rPr>
+          <w:lang w:val="id_ID" w:bidi="id_ID"/>
+        </w:rPr>
+      </w:r>
+      <w:r>
+        <w:rPr>
+          <w:lang w:val="id_ID" w:bidi="id_ID"/>
+        </w:rPr>
+      </w:r>
+    </w:p>
+    <w:p>
+      <w:pPr/>
+      <w:r>
+        <w:rPr>
+          <w:lang w:val="id_ID" w:bidi="id_ID"/>
+        </w:rPr>
+      </w:r>
+    </w:p>
+    <w:p>
+      <w:pPr>
+        <w:pStyle w:val="Heading2"/>
+      </w:pPr>
+      <w:r>
+        <w:rPr>
+          <w:lang w:val="id_ID" w:bidi="id_ID"/>
+        </w:rPr>
+        <w:t>1 Raja-raja 7:2–5</w:t>
+      </w:r>
+      <w:r>
+        <w:rPr>
+          <w:lang w:val="id_ID" w:bidi="id_ID"/>
+        </w:rPr>
+      </w:r>
+    </w:p>
+    <w:p>
+      <w:pPr/>
+      <w:r>
+        <w:rPr>
+          <w:lang w:val="id_ID" w:bidi="id_ID"/>
+        </w:rPr>
+      </w:r>
+      <w:r>
+        <w:rPr>
+          <w:lang w:val="id_ID" w:bidi="id_ID"/>
+        </w:rPr>
+        <w:t xml:space="preserve">Gedung </w:t>
+      </w:r>
+      <w:r>
+        <w:rPr>
+          <w:lang w:val="id_ID" w:bidi="id_ID"/>
+        </w:rPr>
+        <w:t xml:space="preserve">”Hutan Libanon” </w:t>
+      </w:r>
+      <w:r>
+        <w:rPr>
+          <w:lang w:val="id_ID" w:bidi="id_ID"/>
+        </w:rPr>
+        <w:t>dinamai demikian karena penggunaan kayu aras yang melimpah dalam pembangunannya. Istana ini akan menampung 300 perisai emas (</w:t>
+      </w:r>
+      <w:hyperlink r:id="rId245">
+        <w:r>
+          <w:rPr>
+            <w:lang w:val="id_ID" w:bidi="id_ID"/>
+          </w:rPr>
+          <w:rPr>
+            <w:color w:val="0000EE"/>
+            <w:u w:val="single"/>
+          </w:rPr>
+          <w:t>1Raj. 10:16–17</w:t>
+        </w:r>
+      </w:hyperlink>
+      <w:r>
+        <w:rPr>
+          <w:lang w:val="id_ID" w:bidi="id_ID"/>
+        </w:rPr>
+        <w:t xml:space="preserve">) dan mungkin berfungsi sebagai gudang harta dan persenjataan (lihat </w:t>
+      </w:r>
+      <w:hyperlink r:id="rId246">
+        <w:r>
+          <w:rPr>
+            <w:lang w:val="id_ID" w:bidi="id_ID"/>
+          </w:rPr>
+          <w:rPr>
+            <w:color w:val="0000EE"/>
+            <w:u w:val="single"/>
+          </w:rPr>
+          <w:t>1Raj. 12:25–28</w:t>
+        </w:r>
+      </w:hyperlink>
+      <w:r>
+        <w:rPr>
+          <w:lang w:val="id_ID" w:bidi="id_ID"/>
+        </w:rPr>
+        <w:t xml:space="preserve">; </w:t>
+      </w:r>
+      <w:hyperlink r:id="rId247">
+        <w:r>
+          <w:rPr>
+            <w:lang w:val="id_ID" w:bidi="id_ID"/>
+          </w:rPr>
+          <w:rPr>
+            <w:color w:val="0000EE"/>
+            <w:u w:val="single"/>
+          </w:rPr>
+          <w:t>Yes. 22:8</w:t>
+        </w:r>
+      </w:hyperlink>
+      <w:r>
+        <w:rPr>
+          <w:lang w:val="id_ID" w:bidi="id_ID"/>
+        </w:rPr>
+        <w:t>). Firaun Mesir, Sisak, kemudian membawa pergi perisai-perisai tersebut sebagai rampasan perang (</w:t>
+      </w:r>
+      <w:hyperlink r:id="rId248">
+        <w:r>
+          <w:rPr>
+            <w:lang w:val="id_ID" w:bidi="id_ID"/>
+          </w:rPr>
+          <w:rPr>
+            <w:color w:val="0000EE"/>
+            <w:u w:val="single"/>
+          </w:rPr>
+          <w:t>1Raj. 14:27</w:t>
+        </w:r>
+      </w:hyperlink>
+      <w:r>
+        <w:rPr>
+          <w:lang w:val="id_ID" w:bidi="id_ID"/>
+        </w:rPr>
+        <w:t>).</w:t>
+      </w:r>
+      <w:r>
+        <w:rPr>
+          <w:lang w:val="id_ID" w:bidi="id_ID"/>
+        </w:rPr>
+      </w:r>
+      <w:r>
+        <w:rPr>
+          <w:lang w:val="id_ID" w:bidi="id_ID"/>
+        </w:rPr>
+      </w:r>
+    </w:p>
+    <w:p>
+      <w:pPr/>
+      <w:r>
+        <w:rPr>
+          <w:lang w:val="id_ID" w:bidi="id_ID"/>
+        </w:rPr>
+      </w:r>
+    </w:p>
+    <w:p>
+      <w:pPr>
+        <w:pStyle w:val="Heading2"/>
+      </w:pPr>
+      <w:r>
+        <w:rPr>
+          <w:lang w:val="id_ID" w:bidi="id_ID"/>
+        </w:rPr>
+        <w:t>1 Raja-raja 7:6–8</w:t>
+      </w:r>
+      <w:r>
+        <w:rPr>
+          <w:lang w:val="id_ID" w:bidi="id_ID"/>
+        </w:rPr>
+      </w:r>
+    </w:p>
+    <w:p>
+      <w:pPr/>
+      <w:r>
+        <w:rPr>
+          <w:lang w:val="id_ID" w:bidi="id_ID"/>
+        </w:rPr>
+      </w:r>
+      <w:r>
+        <w:rPr>
+          <w:lang w:val="id_ID" w:bidi="id_ID"/>
+        </w:rPr>
+        <w:t xml:space="preserve">Balai Saka tampaknya merupakan pintu masuk bertiang ke </w:t>
+      </w:r>
+      <w:r>
+        <w:rPr>
+          <w:lang w:val="id_ID" w:bidi="id_ID"/>
+        </w:rPr>
+        <w:t>Balai Singgasana</w:t>
+      </w:r>
+      <w:r>
+        <w:rPr>
+          <w:lang w:val="id_ID" w:bidi="id_ID"/>
+        </w:rPr>
+        <w:t xml:space="preserve">, tempat Salomo duduk untuk mendengarkan masalah hukum (lihat juga </w:t>
+      </w:r>
+      <w:hyperlink r:id="rId249">
+        <w:r>
+          <w:rPr>
+            <w:lang w:val="id_ID" w:bidi="id_ID"/>
+          </w:rPr>
+          <w:rPr>
+            <w:color w:val="0000EE"/>
+            <w:u w:val="single"/>
+          </w:rPr>
+          <w:t>1Raj. 10:18–20</w:t>
+        </w:r>
+      </w:hyperlink>
+      <w:r>
+        <w:rPr>
+          <w:lang w:val="id_ID" w:bidi="id_ID"/>
+        </w:rPr>
+        <w:t xml:space="preserve">). Balai Singgasana yang serupa telah ditemukan di Siria dan Mesopotamia. • Salomo mendirikan tempat tinggal terpisah untuk putri Firaun (lihat </w:t>
+      </w:r>
+      <w:hyperlink r:id="rId250">
+        <w:r>
+          <w:rPr>
+            <w:lang w:val="id_ID" w:bidi="id_ID"/>
+          </w:rPr>
+          <w:rPr>
+            <w:color w:val="0000EE"/>
+            <w:u w:val="single"/>
+          </w:rPr>
+          <w:t>1Raj. 3:1</w:t>
+        </w:r>
+      </w:hyperlink>
+      <w:r>
+        <w:rPr>
+          <w:lang w:val="id_ID" w:bidi="id_ID"/>
+        </w:rPr>
+        <w:t xml:space="preserve">; </w:t>
+      </w:r>
+      <w:hyperlink r:id="rId122">
+        <w:r>
+          <w:rPr>
+            <w:lang w:val="id_ID" w:bidi="id_ID"/>
+          </w:rPr>
+          <w:rPr>
+            <w:color w:val="0000EE"/>
+            <w:u w:val="single"/>
+          </w:rPr>
+          <w:t>9:24</w:t>
+        </w:r>
+      </w:hyperlink>
+      <w:r>
+        <w:rPr>
+          <w:lang w:val="id_ID" w:bidi="id_ID"/>
+        </w:rPr>
+        <w:t xml:space="preserve">; </w:t>
+      </w:r>
+      <w:hyperlink r:id="rId123">
+        <w:r>
+          <w:rPr>
+            <w:lang w:val="id_ID" w:bidi="id_ID"/>
+          </w:rPr>
+          <w:rPr>
+            <w:color w:val="0000EE"/>
+            <w:u w:val="single"/>
+          </w:rPr>
+          <w:t>2Taw. 8:11</w:t>
+        </w:r>
+      </w:hyperlink>
+      <w:r>
+        <w:rPr>
+          <w:lang w:val="id_ID" w:bidi="id_ID"/>
+        </w:rPr>
+        <w:t>).</w:t>
+      </w:r>
+      <w:r>
+        <w:rPr>
+          <w:lang w:val="id_ID" w:bidi="id_ID"/>
+        </w:rPr>
+      </w:r>
+      <w:r>
+        <w:rPr>
+          <w:lang w:val="id_ID" w:bidi="id_ID"/>
+        </w:rPr>
+      </w:r>
+    </w:p>
+    <w:p>
+      <w:pPr/>
+      <w:r>
+        <w:rPr>
+          <w:lang w:val="id_ID" w:bidi="id_ID"/>
+        </w:rPr>
+      </w:r>
+    </w:p>
+    <w:p>
+      <w:pPr>
+        <w:pStyle w:val="Heading2"/>
+      </w:pPr>
+      <w:r>
+        <w:rPr>
+          <w:lang w:val="id_ID" w:bidi="id_ID"/>
+        </w:rPr>
+        <w:t>1 Raja-raja 7:9–11</w:t>
+      </w:r>
+      <w:r>
+        <w:rPr>
+          <w:lang w:val="id_ID" w:bidi="id_ID"/>
+        </w:rPr>
+      </w:r>
+    </w:p>
+    <w:p>
+      <w:pPr/>
+      <w:r>
+        <w:rPr>
+          <w:lang w:val="id_ID" w:bidi="id_ID"/>
+        </w:rPr>
+      </w:r>
+      <w:r>
+        <w:rPr>
+          <w:lang w:val="id_ID" w:bidi="id_ID"/>
+        </w:rPr>
+        <w:t>Seperti halnya dengan Bait Suci, batu-batu untuk kompleks istana Salomo adalah batu berkualitas tinggi, dipotong dan dipangkas sesuai spesifikasi yang tepat. Pekerjaan batu serupa telah ditemukan di Megido. Kayu aras di antara lapisan dinding memberikan perlindungan yang lebih baik terhadap gempa bumi.</w:t>
+      </w:r>
+      <w:r>
+        <w:rPr>
+          <w:lang w:val="id_ID" w:bidi="id_ID"/>
+        </w:rPr>
+      </w:r>
+      <w:r>
+        <w:rPr>
+          <w:lang w:val="id_ID" w:bidi="id_ID"/>
+        </w:rPr>
+      </w:r>
+    </w:p>
+    <w:p>
+      <w:pPr/>
+      <w:r>
+        <w:rPr>
+          <w:lang w:val="id_ID" w:bidi="id_ID"/>
+        </w:rPr>
+      </w:r>
+    </w:p>
+    <w:p>
+      <w:pPr>
+        <w:pStyle w:val="Heading2"/>
+      </w:pPr>
+      <w:r>
+        <w:rPr>
+          <w:lang w:val="id_ID" w:bidi="id_ID"/>
+        </w:rPr>
+        <w:t>1 Raja-raja 7:12</w:t>
+      </w:r>
+      <w:r>
+        <w:rPr>
+          <w:lang w:val="id_ID" w:bidi="id_ID"/>
+        </w:rPr>
+      </w:r>
+    </w:p>
+    <w:p>
+      <w:pPr/>
+      <w:r>
+        <w:rPr>
+          <w:lang w:val="id_ID" w:bidi="id_ID"/>
+        </w:rPr>
+      </w:r>
+      <w:r>
+        <w:rPr>
+          <w:lang w:val="id_ID" w:bidi="id_ID"/>
+        </w:rPr>
+        <w:t xml:space="preserve">Pelataran besar yang mengelilingi kompleks Bait suci dan istana menyediakan tempat berkumpul bagi orang-orang (lihat </w:t>
+      </w:r>
+      <w:hyperlink r:id="rId251">
+        <w:r>
+          <w:rPr>
+            <w:lang w:val="id_ID" w:bidi="id_ID"/>
+          </w:rPr>
+          <w:rPr>
+            <w:color w:val="0000EE"/>
+            <w:u w:val="single"/>
+          </w:rPr>
+          <w:t>Yer. 7:1–2</w:t>
+        </w:r>
+      </w:hyperlink>
+      <w:r>
+        <w:rPr>
+          <w:lang w:val="id_ID" w:bidi="id_ID"/>
+        </w:rPr>
+        <w:t xml:space="preserve">; </w:t>
+      </w:r>
+      <w:hyperlink r:id="rId252">
+        <w:r>
+          <w:rPr>
+            <w:lang w:val="id_ID" w:bidi="id_ID"/>
+          </w:rPr>
+          <w:rPr>
+            <w:color w:val="0000EE"/>
+            <w:u w:val="single"/>
+          </w:rPr>
+          <w:t>36:10</w:t>
+        </w:r>
+      </w:hyperlink>
+      <w:r>
+        <w:rPr>
+          <w:lang w:val="id_ID" w:bidi="id_ID"/>
+        </w:rPr>
+        <w:t>).</w:t>
+      </w:r>
+      <w:r>
+        <w:rPr>
+          <w:lang w:val="id_ID" w:bidi="id_ID"/>
+        </w:rPr>
+      </w:r>
+      <w:r>
+        <w:rPr>
+          <w:lang w:val="id_ID" w:bidi="id_ID"/>
+        </w:rPr>
+      </w:r>
+    </w:p>
+    <w:p>
+      <w:pPr/>
+      <w:r>
+        <w:rPr>
+          <w:lang w:val="id_ID" w:bidi="id_ID"/>
+        </w:rPr>
+      </w:r>
+    </w:p>
+    <w:p>
+      <w:pPr>
+        <w:pStyle w:val="Heading2"/>
+      </w:pPr>
+      <w:r>
+        <w:rPr>
+          <w:lang w:val="id_ID" w:bidi="id_ID"/>
+        </w:rPr>
+        <w:t>1 Raja-raja 7:13–14</w:t>
+      </w:r>
+      <w:r>
+        <w:rPr>
+          <w:lang w:val="id_ID" w:bidi="id_ID"/>
+        </w:rPr>
+      </w:r>
+    </w:p>
+    <w:p>
+      <w:pPr/>
+      <w:r>
+        <w:rPr>
+          <w:lang w:val="id_ID" w:bidi="id_ID"/>
+        </w:rPr>
+      </w:r>
+      <w:r>
+        <w:rPr>
+          <w:lang w:val="id_ID" w:bidi="id_ID"/>
+        </w:rPr>
+        <w:t>Hiram: Seperti ayahnya, ia adalah seorang ahli dalam pengerjaan perunggu dan bahan lainnya (</w:t>
+      </w:r>
+      <w:hyperlink r:id="rId253">
+        <w:r>
+          <w:rPr>
+            <w:lang w:val="id_ID" w:bidi="id_ID"/>
+          </w:rPr>
+          <w:rPr>
+            <w:color w:val="0000EE"/>
+            <w:u w:val="single"/>
+          </w:rPr>
+          <w:t>2Taw. 2:12–14</w:t>
+        </w:r>
+      </w:hyperlink>
+      <w:r>
+        <w:rPr>
+          <w:lang w:val="id_ID" w:bidi="id_ID"/>
+        </w:rPr>
+        <w:t>). Karya logamnya yang terampil dijelaskan dalam ayat-ayat berikut (</w:t>
+      </w:r>
+      <w:hyperlink r:id="rId254">
+        <w:r>
+          <w:rPr>
+            <w:lang w:val="id_ID" w:bidi="id_ID"/>
+          </w:rPr>
+          <w:rPr>
+            <w:color w:val="0000EE"/>
+            <w:u w:val="single"/>
+          </w:rPr>
+          <w:t>1Raj. 7:15–50</w:t>
+        </w:r>
+      </w:hyperlink>
+      <w:r>
+        <w:rPr>
+          <w:lang w:val="id_ID" w:bidi="id_ID"/>
+        </w:rPr>
+        <w:t xml:space="preserve">). • terampil dan berbakat (secara harfiah </w:t>
+      </w:r>
+      <w:r>
+        <w:rPr>
+          <w:i/>
+          <w:lang w:val="id_ID" w:bidi="id_ID"/>
+        </w:rPr>
+        <w:t>ia penuh dengan keahlian, pengertian dan pengetahuan</w:t>
+      </w:r>
+      <w:r>
+        <w:rPr>
+          <w:lang w:val="id_ID" w:bidi="id_ID"/>
+        </w:rPr>
+        <w:t>): Bangsa Israel sangat menekankan keterampilan praktis dan menganggapnya sebagai bentuk kebijaksanaan (</w:t>
+      </w:r>
+      <w:hyperlink r:id="rId255">
+        <w:r>
+          <w:rPr>
+            <w:lang w:val="id_ID" w:bidi="id_ID"/>
+          </w:rPr>
+          <w:rPr>
+            <w:color w:val="0000EE"/>
+            <w:u w:val="single"/>
+          </w:rPr>
+          <w:t>Ams. 22:29</w:t>
+        </w:r>
+      </w:hyperlink>
+      <w:r>
+        <w:rPr>
+          <w:lang w:val="id_ID" w:bidi="id_ID"/>
+        </w:rPr>
+        <w:t>).</w:t>
+      </w:r>
+      <w:r>
+        <w:rPr>
+          <w:lang w:val="id_ID" w:bidi="id_ID"/>
+        </w:rPr>
+      </w:r>
+      <w:r>
+        <w:rPr>
+          <w:lang w:val="id_ID" w:bidi="id_ID"/>
+        </w:rPr>
+      </w:r>
+    </w:p>
+    <w:p>
+      <w:pPr/>
+      <w:r>
+        <w:rPr>
+          <w:lang w:val="id_ID" w:bidi="id_ID"/>
+        </w:rPr>
+      </w:r>
+    </w:p>
+    <w:p>
+      <w:pPr>
+        <w:pStyle w:val="Heading2"/>
+      </w:pPr>
+      <w:r>
+        <w:rPr>
+          <w:lang w:val="id_ID" w:bidi="id_ID"/>
+        </w:rPr>
+        <w:t>1 Raja-raja 7:15–22</w:t>
+      </w:r>
+      <w:r>
+        <w:rPr>
+          <w:lang w:val="id_ID" w:bidi="id_ID"/>
+        </w:rPr>
+      </w:r>
+    </w:p>
+    <w:p>
+      <w:pPr/>
+      <w:r>
+        <w:rPr>
+          <w:lang w:val="id_ID" w:bidi="id_ID"/>
+        </w:rPr>
+      </w:r>
+      <w:r>
+        <w:rPr>
+          <w:lang w:val="id_ID" w:bidi="id_ID"/>
+        </w:rPr>
+        <w:t>Dua pilar perunggu tersebut mungkin berdiri bebas karena narator menggambarkannya di sini, bukan dalam pembahasan sebelumnya tentang struktur Bait Suci (</w:t>
+      </w:r>
+      <w:hyperlink r:id="rId256">
+        <w:r>
+          <w:rPr>
+            <w:lang w:val="id_ID" w:bidi="id_ID"/>
+          </w:rPr>
+          <w:rPr>
+            <w:color w:val="0000EE"/>
+            <w:u w:val="single"/>
+          </w:rPr>
+          <w:t>1Raj. 6:3–6</w:t>
+        </w:r>
+      </w:hyperlink>
+      <w:r>
+        <w:rPr>
+          <w:lang w:val="id_ID" w:bidi="id_ID"/>
+        </w:rPr>
+        <w:t>).</w:t>
       </w:r>
       <w:r>
         <w:rPr>

</xml_diff>